<commit_message>
Molar kutleler kitap genelinde standartlastirildi; propanon/butanon adlandirmasi, 1.5 sicaklik cekincesi, ASPILSAN, Alacahoyuk ve gunes pili verim bilgileri dogrulanip guncellendi
</commit_message>
<xml_diff>
--- a/CevapAnahtari/Kimya12-tema-1-cevaplar.docx
+++ b/CevapAnahtari/Kimya12-tema-1-cevaplar.docx
@@ -2421,7 +2421,7 @@
           <w:rFonts w:ascii="Times New Roman" w:hAnsi="Times New Roman" w:cs="Times New Roman"/>
           <w:lang w:val="tr-TR"/>
         </w:rPr>
-        <w:t xml:space="preserve">2. Aşama: Çinko 0,327 g (0,327/65,4 = 0,00500 mol) azalmış, bakır 0,318 g (0,318/63,5 = 0,00501 mol) artmıştır. Çinkoda yükseltgenme: Zn(k) → Zn</w:t>
+        <w:t xml:space="preserve">2. Aşama: Çinko 0,325 g (0,325/65 = 0,00500 mol) azalmış, bakır 0,320 g (0,320/64 = 0,00500 mol) artmıştır. Çinkoda yükseltgenme: Zn(k) → Zn</w:t>
       </w:r>
       <w:r>
         <w:rPr>
@@ -5159,7 +5159,7 @@
           <w:rFonts w:ascii="Times New Roman" w:hAnsi="Times New Roman" w:cs="Times New Roman"/>
           <w:lang w:val="tr-TR"/>
         </w:rPr>
-        <w:t xml:space="preserve">2. Aşama: Akım 1,00 A: 10, 20, 30, 40 dk → 0,202; 0,405; 0,611; 0,812 g Zn ve 75, 151, 228, 304 mL Cl</w:t>
+        <w:t xml:space="preserve">2. Aşama: Akım 1,00 A: 10, 20, 30, 40 dk → 0,201; 0,403; 0,607; 0,807 g Zn ve 75, 151, 228, 304 mL Cl</w:t>
       </w:r>
       <w:r>
         <w:rPr>
@@ -5174,7 +5174,7 @@
           <w:rFonts w:ascii="Times New Roman" w:hAnsi="Times New Roman" w:cs="Times New Roman"/>
           <w:lang w:val="tr-TR"/>
         </w:rPr>
-        <w:t xml:space="preserve">. Süre 20 dk: 0,50; 1,00; 1,50; 2,00 A → 0,204; 0,405; 0,608; 0,815 g Zn ve 77, 151, 229, 303 mL Cl</w:t>
+        <w:t xml:space="preserve">. Süre 20 dk: 0,50; 1,00; 1,50; 2,00 A → 0,203; 0,403; 0,604; 0,810 g Zn ve 77, 151, 229, 303 mL Cl</w:t>
       </w:r>
       <w:r>
         <w:rPr>
@@ -8807,7 +8807,7 @@
           <w:rFonts w:ascii="Times New Roman" w:hAnsi="Times New Roman" w:cs="Times New Roman"/>
           <w:lang w:val="tr-TR"/>
         </w:rPr>
-        <w:t xml:space="preserve">: 1/6,94 ≈ 0,144 mol e</w:t>
+        <w:t xml:space="preserve">: 1/7 ≈ 0,143 mol e</w:t>
       </w:r>
       <w:r>
         <w:rPr>
@@ -8852,7 +8852,7 @@
           <w:rFonts w:ascii="Times New Roman" w:hAnsi="Times New Roman" w:cs="Times New Roman"/>
           <w:lang w:val="tr-TR"/>
         </w:rPr>
-        <w:t xml:space="preserve">: 1/23,0 ≈ 0,043 mol e</w:t>
+        <w:t xml:space="preserve">: 1/23 ≈ 0,043 mol e</w:t>
       </w:r>
       <w:r>
         <w:rPr>
@@ -9122,7 +9122,7 @@
           <w:rFonts w:ascii="Times New Roman" w:hAnsi="Times New Roman" w:cs="Times New Roman"/>
           <w:lang w:val="tr-TR"/>
         </w:rPr>
-        <w:t xml:space="preserve">B (40 · 30 = 1200 birim yük, 2. denemedeki 20 · 60 = 1200 ile aynıdır; 5,18 g Li. Aynı elektron sayısıyla 2 mol Li’ye karşılık 1 mol Cl</w:t>
+        <w:t xml:space="preserve">B (40 · 30 = 1200 birim yük, 2. denemedeki 20 · 60 = 1200 ile aynıdır; 5,22 g Li. Aynı elektron sayısıyla 2 mol Li’ye karşılık 1 mol Cl</w:t>
       </w:r>
       <w:r>
         <w:rPr>

</xml_diff>

<commit_message>
Kalip ici tablo basliklari kaldirildi, gorsel/grafik basliklari numarasiz etikete cevrildi; atiflar ve harf siralari guncellendi
</commit_message>
<xml_diff>
--- a/CevapAnahtari/Kimya12-tema-1-cevaplar.docx
+++ b/CevapAnahtari/Kimya12-tema-1-cevaplar.docx
@@ -3117,7 +3117,22 @@
           <w:rFonts w:ascii="Times New Roman" w:hAnsi="Times New Roman" w:cs="Times New Roman"/>
           <w:lang w:val="tr-TR"/>
         </w:rPr>
-        <w:t xml:space="preserve">3. Aşama: Genelleme: Bir elektrokimyasal hücrenin standart potansiyeli katot ve anot yarı tepkimelerinin standart indirgenme potansiyellerinin farkına eşittir. Tablo C: +1,10; −1,10; +0,46; −0,46; +0,76; −0,34 V. E°</w:t>
+        <w:t xml:space="preserve">3. Aşama: Genelleme: Bir elektrokimyasal hücrenin standart potansiyeli katot ve anot yarı tepkimelerinin standart indirgenme potansiyellerinin farkına eşittir. Tepkimelere ait gözlemler tablosundaki E°</w:t>
+      </w:r>
+      <w:r>
+        <w:rPr>
+          <w:rFonts w:ascii="Times New Roman" w:hAnsi="Times New Roman" w:cs="Times New Roman"/>
+          <w:vertAlign w:val="subscript"/>
+          <w:lang w:val="tr-TR"/>
+        </w:rPr>
+        <w:t xml:space="preserve">hücre</w:t>
+      </w:r>
+      <w:r>
+        <w:rPr>
+          <w:rFonts w:ascii="Times New Roman" w:hAnsi="Times New Roman" w:cs="Times New Roman"/>
+          <w:lang w:val="tr-TR"/>
+        </w:rPr>
+        <w:t xml:space="preserve"> değerleri: +1,10; −1,10; +0,46; −0,46; +0,76; −0,34 V. E°</w:t>
       </w:r>
       <w:r>
         <w:rPr>
@@ -4737,7 +4752,7 @@
           <w:rFonts w:ascii="Times New Roman" w:hAnsi="Times New Roman" w:cs="Times New Roman"/>
           <w:lang w:val="tr-TR"/>
         </w:rPr>
-        <w:t xml:space="preserve">6. Aşama: Venn şeması için Tablo B’ye bakınız. Diğer kısımlar: Öğrenci özgün cevabını oluşturur.</w:t>
+        <w:t xml:space="preserve">6. Aşama: Venn şeması için Tablo A’ya bakınız. Diğer kısımlar: Öğrenci özgün cevabını oluşturur.</w:t>
       </w:r>
     </w:p>
     <w:p>
@@ -5250,7 +5265,7 @@
           <w:rFonts w:ascii="Times New Roman" w:hAnsi="Times New Roman" w:cs="Times New Roman"/>
           <w:lang w:val="tr-TR"/>
         </w:rPr>
-        <w:t xml:space="preserve"> hacmi de aynı örüntüyü gösterir. Tablo B: Aynı yükle Na, Zn ve Al mol sayıları 1 : 1/2 : 1/3 oranındadır; iyon yükü arttıkça bir atom için gereken elektron sayısı artar ve oluşan metalin mol sayısı azalır. Araştırma: Öğrenci özgün cevabını oluşturur.</w:t>
+        <w:t xml:space="preserve"> hacmi de aynı örüntüyü gösterir. Aynı yükle yapılan elektrolizlerde Na, Zn ve Al mol sayıları 1 : 1/2 : 1/3 oranındadır; iyon yükü arttıkça bir atom için gereken elektron sayısı artar ve oluşan metalin mol sayısı azalır. Araştırma: Öğrenci özgün cevabını oluşturur.</w:t>
       </w:r>
     </w:p>
     <w:p>

</xml_diff>

<commit_message>
Tum konular: tanim ve gosterimler duzeltildi, programdaki uygulamalar etkinliklere islendi, bilgi metinlerinde etkinlikten farkli ornekler ve yeni gorseller kullanildi, geri atiflar ve tekrarlar kaldirildi, bilimsel kosullar eklendi; cevap anahtarlari guncellendi
</commit_message>
<xml_diff>
--- a/CevapAnahtari/Kimya12-tema-1-cevaplar.docx
+++ b/CevapAnahtari/Kimya12-tema-1-cevaplar.docx
@@ -1001,7 +1001,7 @@
           <w:rFonts w:ascii="Times New Roman" w:hAnsi="Times New Roman" w:cs="Times New Roman"/>
           <w:lang w:val="tr-TR"/>
         </w:rPr>
-        <w:t xml:space="preserve">4. a) n(Zn) = 6,5/65 = 0,10 mol; aktarılan elektron = 0,10 · 2 = 0,20 mol. b) n(Cu) = 0,20/2 = 0,10 mol; m(Cu) = 0,10 · 64 = 6,4 g.</w:t>
+        <w:t xml:space="preserve">4. a) n(Mg) = 2,4/24 = 0,10 mol; aktarılan elektron = 0,10 · 2 = 0,20 mol. b) n(Cu) = 0,20/2 = 0,10 mol; m(Cu) = 0,10 · 64 = 6,4 g.</w:t>
       </w:r>
     </w:p>
     <w:p>
@@ -1053,8 +1053,8 @@
       <w:r>
         <w:rPr>
           <w:rFonts w:ascii="Times New Roman" w:hAnsi="Times New Roman" w:cs="Times New Roman"/>
-          <w:vertAlign w:val="superscript"/>
-          <w:lang w:val="tr-TR"/>
+          <w:lang w:val="tr-TR"/>
+          <w:vertAlign w:val="superscript"/>
         </w:rPr>
         <w:t xml:space="preserve">2+</w:t>
       </w:r>
@@ -1068,8 +1068,8 @@
       <w:r>
         <w:rPr>
           <w:rFonts w:ascii="Times New Roman" w:hAnsi="Times New Roman" w:cs="Times New Roman"/>
-          <w:vertAlign w:val="superscript"/>
-          <w:lang w:val="tr-TR"/>
+          <w:lang w:val="tr-TR"/>
+          <w:vertAlign w:val="superscript"/>
         </w:rPr>
         <w:t xml:space="preserve">−</w:t>
       </w:r>
@@ -1078,15 +1078,15 @@
           <w:rFonts w:ascii="Times New Roman" w:hAnsi="Times New Roman" w:cs="Times New Roman"/>
           <w:lang w:val="tr-TR"/>
         </w:rPr>
-        <w:t xml:space="preserve">; 2H</w:t>
-      </w:r>
-      <w:r>
-        <w:rPr>
-          <w:rFonts w:ascii="Times New Roman" w:hAnsi="Times New Roman" w:cs="Times New Roman"/>
-          <w:vertAlign w:val="superscript"/>
-          <w:lang w:val="tr-TR"/>
-        </w:rPr>
-        <w:t xml:space="preserve">+</w:t>
+        <w:t xml:space="preserve">; Pb</w:t>
+      </w:r>
+      <w:r>
+        <w:rPr>
+          <w:rFonts w:ascii="Times New Roman" w:hAnsi="Times New Roman" w:cs="Times New Roman"/>
+          <w:lang w:val="tr-TR"/>
+          <w:vertAlign w:val="superscript"/>
+        </w:rPr>
+        <w:t xml:space="preserve">2+</w:t>
       </w:r>
       <w:r>
         <w:rPr>
@@ -1098,8 +1098,8 @@
       <w:r>
         <w:rPr>
           <w:rFonts w:ascii="Times New Roman" w:hAnsi="Times New Roman" w:cs="Times New Roman"/>
-          <w:vertAlign w:val="superscript"/>
-          <w:lang w:val="tr-TR"/>
+          <w:lang w:val="tr-TR"/>
+          <w:vertAlign w:val="superscript"/>
         </w:rPr>
         <w:t xml:space="preserve">−</w:t>
       </w:r>
@@ -1108,22 +1108,37 @@
           <w:rFonts w:ascii="Times New Roman" w:hAnsi="Times New Roman" w:cs="Times New Roman"/>
           <w:lang w:val="tr-TR"/>
         </w:rPr>
-        <w:t xml:space="preserve"> → H</w:t>
-      </w:r>
-      <w:r>
-        <w:rPr>
-          <w:rFonts w:ascii="Times New Roman" w:hAnsi="Times New Roman" w:cs="Times New Roman"/>
-          <w:vertAlign w:val="subscript"/>
-          <w:lang w:val="tr-TR"/>
-        </w:rPr>
-        <w:t xml:space="preserve">2</w:t>
-      </w:r>
-      <w:r>
-        <w:rPr>
-          <w:rFonts w:ascii="Times New Roman" w:hAnsi="Times New Roman" w:cs="Times New Roman"/>
-          <w:lang w:val="tr-TR"/>
-        </w:rPr>
-        <w:t xml:space="preserve">(g).</w:t>
+        <w:t xml:space="preserve"> → Pb(k); net: Mg(k) + Pb</w:t>
+      </w:r>
+      <w:r>
+        <w:rPr>
+          <w:rFonts w:ascii="Times New Roman" w:hAnsi="Times New Roman" w:cs="Times New Roman"/>
+          <w:lang w:val="tr-TR"/>
+          <w:vertAlign w:val="superscript"/>
+        </w:rPr>
+        <w:t xml:space="preserve">2+</w:t>
+      </w:r>
+      <w:r>
+        <w:rPr>
+          <w:rFonts w:ascii="Times New Roman" w:hAnsi="Times New Roman" w:cs="Times New Roman"/>
+          <w:lang w:val="tr-TR"/>
+        </w:rPr>
+        <w:t xml:space="preserve">(suda) → Mg</w:t>
+      </w:r>
+      <w:r>
+        <w:rPr>
+          <w:rFonts w:ascii="Times New Roman" w:hAnsi="Times New Roman" w:cs="Times New Roman"/>
+          <w:lang w:val="tr-TR"/>
+          <w:vertAlign w:val="superscript"/>
+        </w:rPr>
+        <w:t xml:space="preserve">2+</w:t>
+      </w:r>
+      <w:r>
+        <w:rPr>
+          <w:rFonts w:ascii="Times New Roman" w:hAnsi="Times New Roman" w:cs="Times New Roman"/>
+          <w:lang w:val="tr-TR"/>
+        </w:rPr>
+        <w:t xml:space="preserve">(suda) + Pb(k).</w:t>
       </w:r>
     </w:p>
     <w:p>
@@ -1668,8 +1683,8 @@
       <w:r>
         <w:rPr>
           <w:rFonts w:ascii="Times New Roman" w:hAnsi="Times New Roman" w:cs="Times New Roman"/>
+          <w:lang w:val="tr-TR"/>
           <w:vertAlign w:val="subscript"/>
-          <w:lang w:val="tr-TR"/>
         </w:rPr>
         <w:t xml:space="preserve">3</w:t>
       </w:r>
@@ -1683,8 +1698,8 @@
       <w:r>
         <w:rPr>
           <w:rFonts w:ascii="Times New Roman" w:hAnsi="Times New Roman" w:cs="Times New Roman"/>
+          <w:lang w:val="tr-TR"/>
           <w:vertAlign w:val="subscript"/>
-          <w:lang w:val="tr-TR"/>
         </w:rPr>
         <w:t xml:space="preserve">2</w:t>
       </w:r>
@@ -1698,8 +1713,8 @@
       <w:r>
         <w:rPr>
           <w:rFonts w:ascii="Times New Roman" w:hAnsi="Times New Roman" w:cs="Times New Roman"/>
-          <w:vertAlign w:val="superscript"/>
-          <w:lang w:val="tr-TR"/>
+          <w:lang w:val="tr-TR"/>
+          <w:vertAlign w:val="superscript"/>
         </w:rPr>
         <w:t xml:space="preserve">2+</w:t>
       </w:r>
@@ -1713,8 +1728,8 @@
       <w:r>
         <w:rPr>
           <w:rFonts w:ascii="Times New Roman" w:hAnsi="Times New Roman" w:cs="Times New Roman"/>
-          <w:vertAlign w:val="superscript"/>
-          <w:lang w:val="tr-TR"/>
+          <w:lang w:val="tr-TR"/>
+          <w:vertAlign w:val="superscript"/>
         </w:rPr>
         <w:t xml:space="preserve">2+</w:t>
       </w:r>
@@ -1723,13 +1738,13 @@
           <w:rFonts w:ascii="Times New Roman" w:hAnsi="Times New Roman" w:cs="Times New Roman"/>
           <w:lang w:val="tr-TR"/>
         </w:rPr>
-        <w:t xml:space="preserve">(suda) + Cu(k). Ag + HCl: Gerçekleşmez. Fe + Pb(NO</w:t>
-      </w:r>
-      <w:r>
-        <w:rPr>
-          <w:rFonts w:ascii="Times New Roman" w:hAnsi="Times New Roman" w:cs="Times New Roman"/>
+        <w:t xml:space="preserve">(suda) + Cu(k). Ag + HCl: Gerçekleşmez. Pb + AgNO</w:t>
+      </w:r>
+      <w:r>
+        <w:rPr>
+          <w:rFonts w:ascii="Times New Roman" w:hAnsi="Times New Roman" w:cs="Times New Roman"/>
+          <w:lang w:val="tr-TR"/>
           <w:vertAlign w:val="subscript"/>
-          <w:lang w:val="tr-TR"/>
         </w:rPr>
         <w:t xml:space="preserve">3</w:t>
       </w:r>
@@ -1738,13 +1753,58 @@
           <w:rFonts w:ascii="Times New Roman" w:hAnsi="Times New Roman" w:cs="Times New Roman"/>
           <w:lang w:val="tr-TR"/>
         </w:rPr>
+        <w:t xml:space="preserve">: Gerçekleşir; Pb(k) + 2Ag</w:t>
+      </w:r>
+      <w:r>
+        <w:rPr>
+          <w:rFonts w:ascii="Times New Roman" w:hAnsi="Times New Roman" w:cs="Times New Roman"/>
+          <w:lang w:val="tr-TR"/>
+          <w:vertAlign w:val="superscript"/>
+        </w:rPr>
+        <w:t xml:space="preserve">+</w:t>
+      </w:r>
+      <w:r>
+        <w:rPr>
+          <w:rFonts w:ascii="Times New Roman" w:hAnsi="Times New Roman" w:cs="Times New Roman"/>
+          <w:lang w:val="tr-TR"/>
+        </w:rPr>
+        <w:t xml:space="preserve">(suda) → Pb</w:t>
+      </w:r>
+      <w:r>
+        <w:rPr>
+          <w:rFonts w:ascii="Times New Roman" w:hAnsi="Times New Roman" w:cs="Times New Roman"/>
+          <w:lang w:val="tr-TR"/>
+          <w:vertAlign w:val="superscript"/>
+        </w:rPr>
+        <w:t xml:space="preserve">2+</w:t>
+      </w:r>
+      <w:r>
+        <w:rPr>
+          <w:rFonts w:ascii="Times New Roman" w:hAnsi="Times New Roman" w:cs="Times New Roman"/>
+          <w:lang w:val="tr-TR"/>
+        </w:rPr>
+        <w:t xml:space="preserve">(suda) + 2Ag(k). Sn + Zn(NO</w:t>
+      </w:r>
+      <w:r>
+        <w:rPr>
+          <w:rFonts w:ascii="Times New Roman" w:hAnsi="Times New Roman" w:cs="Times New Roman"/>
+          <w:lang w:val="tr-TR"/>
+          <w:vertAlign w:val="subscript"/>
+        </w:rPr>
+        <w:t xml:space="preserve">3</w:t>
+      </w:r>
+      <w:r>
+        <w:rPr>
+          <w:rFonts w:ascii="Times New Roman" w:hAnsi="Times New Roman" w:cs="Times New Roman"/>
+          <w:lang w:val="tr-TR"/>
+        </w:rPr>
         <w:t xml:space="preserve">)</w:t>
       </w:r>
       <w:r>
         <w:rPr>
           <w:rFonts w:ascii="Times New Roman" w:hAnsi="Times New Roman" w:cs="Times New Roman"/>
+          <w:lang w:val="tr-TR"/>
           <w:vertAlign w:val="subscript"/>
-          <w:lang w:val="tr-TR"/>
         </w:rPr>
         <w:t xml:space="preserve">2</w:t>
       </w:r>
@@ -1753,13 +1813,88 @@
           <w:rFonts w:ascii="Times New Roman" w:hAnsi="Times New Roman" w:cs="Times New Roman"/>
           <w:lang w:val="tr-TR"/>
         </w:rPr>
-        <w:t xml:space="preserve">: Gerçekleşir; Fe(k) + Pb</w:t>
-      </w:r>
-      <w:r>
-        <w:rPr>
-          <w:rFonts w:ascii="Times New Roman" w:hAnsi="Times New Roman" w:cs="Times New Roman"/>
-          <w:vertAlign w:val="superscript"/>
-          <w:lang w:val="tr-TR"/>
+        <w:t xml:space="preserve">: Gerçekleşmez. Al + HCl: Gerçekleşir; 2Al(k) + 6H</w:t>
+      </w:r>
+      <w:r>
+        <w:rPr>
+          <w:rFonts w:ascii="Times New Roman" w:hAnsi="Times New Roman" w:cs="Times New Roman"/>
+          <w:lang w:val="tr-TR"/>
+          <w:vertAlign w:val="superscript"/>
+        </w:rPr>
+        <w:t xml:space="preserve">+</w:t>
+      </w:r>
+      <w:r>
+        <w:rPr>
+          <w:rFonts w:ascii="Times New Roman" w:hAnsi="Times New Roman" w:cs="Times New Roman"/>
+          <w:lang w:val="tr-TR"/>
+        </w:rPr>
+        <w:t xml:space="preserve">(suda) → 2Al</w:t>
+      </w:r>
+      <w:r>
+        <w:rPr>
+          <w:rFonts w:ascii="Times New Roman" w:hAnsi="Times New Roman" w:cs="Times New Roman"/>
+          <w:lang w:val="tr-TR"/>
+          <w:vertAlign w:val="superscript"/>
+        </w:rPr>
+        <w:t xml:space="preserve">3+</w:t>
+      </w:r>
+      <w:r>
+        <w:rPr>
+          <w:rFonts w:ascii="Times New Roman" w:hAnsi="Times New Roman" w:cs="Times New Roman"/>
+          <w:lang w:val="tr-TR"/>
+        </w:rPr>
+        <w:t xml:space="preserve">(suda) + 3H</w:t>
+      </w:r>
+      <w:r>
+        <w:rPr>
+          <w:rFonts w:ascii="Times New Roman" w:hAnsi="Times New Roman" w:cs="Times New Roman"/>
+          <w:lang w:val="tr-TR"/>
+          <w:vertAlign w:val="subscript"/>
+        </w:rPr>
+        <w:t xml:space="preserve">2</w:t>
+      </w:r>
+      <w:r>
+        <w:rPr>
+          <w:rFonts w:ascii="Times New Roman" w:hAnsi="Times New Roman" w:cs="Times New Roman"/>
+          <w:lang w:val="tr-TR"/>
+        </w:rPr>
+        <w:t xml:space="preserve">(g). Ni + AgNO</w:t>
+      </w:r>
+      <w:r>
+        <w:rPr>
+          <w:rFonts w:ascii="Times New Roman" w:hAnsi="Times New Roman" w:cs="Times New Roman"/>
+          <w:lang w:val="tr-TR"/>
+          <w:vertAlign w:val="subscript"/>
+        </w:rPr>
+        <w:t xml:space="preserve">3</w:t>
+      </w:r>
+      <w:r>
+        <w:rPr>
+          <w:rFonts w:ascii="Times New Roman" w:hAnsi="Times New Roman" w:cs="Times New Roman"/>
+          <w:lang w:val="tr-TR"/>
+        </w:rPr>
+        <w:t xml:space="preserve">: Gerçekleşir; Ni(k) + 2Ag</w:t>
+      </w:r>
+      <w:r>
+        <w:rPr>
+          <w:rFonts w:ascii="Times New Roman" w:hAnsi="Times New Roman" w:cs="Times New Roman"/>
+          <w:lang w:val="tr-TR"/>
+          <w:vertAlign w:val="superscript"/>
+        </w:rPr>
+        <w:t xml:space="preserve">+</w:t>
+      </w:r>
+      <w:r>
+        <w:rPr>
+          <w:rFonts w:ascii="Times New Roman" w:hAnsi="Times New Roman" w:cs="Times New Roman"/>
+          <w:lang w:val="tr-TR"/>
+        </w:rPr>
+        <w:t xml:space="preserve">(suda) → Ni</w:t>
+      </w:r>
+      <w:r>
+        <w:rPr>
+          <w:rFonts w:ascii="Times New Roman" w:hAnsi="Times New Roman" w:cs="Times New Roman"/>
+          <w:lang w:val="tr-TR"/>
+          <w:vertAlign w:val="superscript"/>
         </w:rPr>
         <w:t xml:space="preserve">2+</w:t>
       </w:r>
@@ -1768,7 +1903,23 @@
           <w:rFonts w:ascii="Times New Roman" w:hAnsi="Times New Roman" w:cs="Times New Roman"/>
           <w:lang w:val="tr-TR"/>
         </w:rPr>
-        <w:t xml:space="preserve">(suda) → Fe</w:t>
+        <w:t xml:space="preserve">(suda) + 2Ag(k).</w:t>
+      </w:r>
+    </w:p>
+    <w:p>
+      <w:pPr>
+        <w:jc w:val="both"/>
+        <w:rPr>
+          <w:rFonts w:ascii="Times New Roman" w:hAnsi="Times New Roman" w:cs="Times New Roman"/>
+          <w:lang w:val="tr-TR"/>
+        </w:rPr>
+      </w:pPr>
+      <w:r>
+        <w:rPr>
+          <w:rFonts w:ascii="Times New Roman" w:hAnsi="Times New Roman" w:cs="Times New Roman"/>
+          <w:lang w:val="tr-TR"/>
+        </w:rPr>
+        <w:t xml:space="preserve">2. D &gt; B &gt; A &gt; C. D, A</w:t>
       </w:r>
       <w:r>
         <w:rPr>
@@ -1783,37 +1934,128 @@
           <w:rFonts w:ascii="Times New Roman" w:hAnsi="Times New Roman" w:cs="Times New Roman"/>
           <w:lang w:val="tr-TR"/>
         </w:rPr>
-        <w:t xml:space="preserve">(suda) + Pb(k). Cu + Zn(NO</w:t>
-      </w:r>
-      <w:r>
-        <w:rPr>
-          <w:rFonts w:ascii="Times New Roman" w:hAnsi="Times New Roman" w:cs="Times New Roman"/>
-          <w:vertAlign w:val="subscript"/>
-          <w:lang w:val="tr-TR"/>
-        </w:rPr>
-        <w:t xml:space="preserve">3</w:t>
-      </w:r>
-      <w:r>
-        <w:rPr>
-          <w:rFonts w:ascii="Times New Roman" w:hAnsi="Times New Roman" w:cs="Times New Roman"/>
-          <w:lang w:val="tr-TR"/>
-        </w:rPr>
-        <w:t xml:space="preserve">)</w:t>
-      </w:r>
-      <w:r>
-        <w:rPr>
-          <w:rFonts w:ascii="Times New Roman" w:hAnsi="Times New Roman" w:cs="Times New Roman"/>
-          <w:vertAlign w:val="subscript"/>
-          <w:lang w:val="tr-TR"/>
-        </w:rPr>
-        <w:t xml:space="preserve">2</w:t>
-      </w:r>
-      <w:r>
-        <w:rPr>
-          <w:rFonts w:ascii="Times New Roman" w:hAnsi="Times New Roman" w:cs="Times New Roman"/>
-          <w:lang w:val="tr-TR"/>
-        </w:rPr>
-        <w:t xml:space="preserve">: Gerçekleşmez. Al + HCl: Gerçekleşir; 2Al(k) + 6H</w:t>
+        <w:t xml:space="preserve">, B</w:t>
+      </w:r>
+      <w:r>
+        <w:rPr>
+          <w:rFonts w:ascii="Times New Roman" w:hAnsi="Times New Roman" w:cs="Times New Roman"/>
+          <w:vertAlign w:val="superscript"/>
+          <w:lang w:val="tr-TR"/>
+        </w:rPr>
+        <w:t xml:space="preserve">2+</w:t>
+      </w:r>
+      <w:r>
+        <w:rPr>
+          <w:rFonts w:ascii="Times New Roman" w:hAnsi="Times New Roman" w:cs="Times New Roman"/>
+          <w:lang w:val="tr-TR"/>
+        </w:rPr>
+        <w:t xml:space="preserve"> ve C</w:t>
+      </w:r>
+      <w:r>
+        <w:rPr>
+          <w:rFonts w:ascii="Times New Roman" w:hAnsi="Times New Roman" w:cs="Times New Roman"/>
+          <w:vertAlign w:val="superscript"/>
+          <w:lang w:val="tr-TR"/>
+        </w:rPr>
+        <w:t xml:space="preserve">2+</w:t>
+      </w:r>
+      <w:r>
+        <w:rPr>
+          <w:rFonts w:ascii="Times New Roman" w:hAnsi="Times New Roman" w:cs="Times New Roman"/>
+          <w:lang w:val="tr-TR"/>
+        </w:rPr>
+        <w:t xml:space="preserve"> iyonlarının hepsini; B, A</w:t>
+      </w:r>
+      <w:r>
+        <w:rPr>
+          <w:rFonts w:ascii="Times New Roman" w:hAnsi="Times New Roman" w:cs="Times New Roman"/>
+          <w:vertAlign w:val="superscript"/>
+          <w:lang w:val="tr-TR"/>
+        </w:rPr>
+        <w:t xml:space="preserve">2+</w:t>
+      </w:r>
+      <w:r>
+        <w:rPr>
+          <w:rFonts w:ascii="Times New Roman" w:hAnsi="Times New Roman" w:cs="Times New Roman"/>
+          <w:lang w:val="tr-TR"/>
+        </w:rPr>
+        <w:t xml:space="preserve"> ve C</w:t>
+      </w:r>
+      <w:r>
+        <w:rPr>
+          <w:rFonts w:ascii="Times New Roman" w:hAnsi="Times New Roman" w:cs="Times New Roman"/>
+          <w:vertAlign w:val="superscript"/>
+          <w:lang w:val="tr-TR"/>
+        </w:rPr>
+        <w:t xml:space="preserve">2+</w:t>
+      </w:r>
+      <w:r>
+        <w:rPr>
+          <w:rFonts w:ascii="Times New Roman" w:hAnsi="Times New Roman" w:cs="Times New Roman"/>
+          <w:lang w:val="tr-TR"/>
+        </w:rPr>
+        <w:t xml:space="preserve"> iyonlarını; A yalnızca C</w:t>
+      </w:r>
+      <w:r>
+        <w:rPr>
+          <w:rFonts w:ascii="Times New Roman" w:hAnsi="Times New Roman" w:cs="Times New Roman"/>
+          <w:vertAlign w:val="superscript"/>
+          <w:lang w:val="tr-TR"/>
+        </w:rPr>
+        <w:t xml:space="preserve">2+</w:t>
+      </w:r>
+      <w:r>
+        <w:rPr>
+          <w:rFonts w:ascii="Times New Roman" w:hAnsi="Times New Roman" w:cs="Times New Roman"/>
+          <w:lang w:val="tr-TR"/>
+        </w:rPr>
+        <w:t xml:space="preserve"> iyonlarını indirger; C hiçbirini indirgemez. HCl verisine göre D, B, A hidrojenin üstünde, C altındadır: D &gt; B &gt; A &gt; H &gt; C.</w:t>
+      </w:r>
+    </w:p>
+    <w:p>
+      <w:pPr>
+        <w:jc w:val="both"/>
+        <w:rPr>
+          <w:rFonts w:ascii="Times New Roman" w:hAnsi="Times New Roman" w:cs="Times New Roman"/>
+          <w:lang w:val="tr-TR"/>
+        </w:rPr>
+      </w:pPr>
+      <w:r>
+        <w:rPr>
+          <w:rFonts w:ascii="Times New Roman" w:hAnsi="Times New Roman" w:cs="Times New Roman"/>
+          <w:lang w:val="tr-TR"/>
+        </w:rPr>
+        <w:t xml:space="preserve">3. Saklanamaz. Bakır gümüşten aktiftir: Cu(k) → Cu</w:t>
+      </w:r>
+      <w:r>
+        <w:rPr>
+          <w:rFonts w:ascii="Times New Roman" w:hAnsi="Times New Roman" w:cs="Times New Roman"/>
+          <w:vertAlign w:val="superscript"/>
+          <w:lang w:val="tr-TR"/>
+        </w:rPr>
+        <w:t xml:space="preserve">2+</w:t>
+      </w:r>
+      <w:r>
+        <w:rPr>
+          <w:rFonts w:ascii="Times New Roman" w:hAnsi="Times New Roman" w:cs="Times New Roman"/>
+          <w:lang w:val="tr-TR"/>
+        </w:rPr>
+        <w:t xml:space="preserve">(suda) + 2e</w:t>
+      </w:r>
+      <w:r>
+        <w:rPr>
+          <w:rFonts w:ascii="Times New Roman" w:hAnsi="Times New Roman" w:cs="Times New Roman"/>
+          <w:vertAlign w:val="superscript"/>
+          <w:lang w:val="tr-TR"/>
+        </w:rPr>
+        <w:t xml:space="preserve">−</w:t>
+      </w:r>
+      <w:r>
+        <w:rPr>
+          <w:rFonts w:ascii="Times New Roman" w:hAnsi="Times New Roman" w:cs="Times New Roman"/>
+          <w:lang w:val="tr-TR"/>
+        </w:rPr>
+        <w:t xml:space="preserve">; 2Ag</w:t>
       </w:r>
       <w:r>
         <w:rPr>
@@ -1828,52 +2070,53 @@
           <w:rFonts w:ascii="Times New Roman" w:hAnsi="Times New Roman" w:cs="Times New Roman"/>
           <w:lang w:val="tr-TR"/>
         </w:rPr>
-        <w:t xml:space="preserve">(suda) → 2Al</w:t>
-      </w:r>
-      <w:r>
-        <w:rPr>
-          <w:rFonts w:ascii="Times New Roman" w:hAnsi="Times New Roman" w:cs="Times New Roman"/>
-          <w:vertAlign w:val="superscript"/>
-          <w:lang w:val="tr-TR"/>
-        </w:rPr>
-        <w:t xml:space="preserve">3+</w:t>
-      </w:r>
-      <w:r>
-        <w:rPr>
-          <w:rFonts w:ascii="Times New Roman" w:hAnsi="Times New Roman" w:cs="Times New Roman"/>
-          <w:lang w:val="tr-TR"/>
-        </w:rPr>
-        <w:t xml:space="preserve">(suda) + 3H</w:t>
-      </w:r>
-      <w:r>
-        <w:rPr>
-          <w:rFonts w:ascii="Times New Roman" w:hAnsi="Times New Roman" w:cs="Times New Roman"/>
-          <w:vertAlign w:val="subscript"/>
-          <w:lang w:val="tr-TR"/>
-        </w:rPr>
-        <w:t xml:space="preserve">2</w:t>
-      </w:r>
-      <w:r>
-        <w:rPr>
-          <w:rFonts w:ascii="Times New Roman" w:hAnsi="Times New Roman" w:cs="Times New Roman"/>
-          <w:lang w:val="tr-TR"/>
-        </w:rPr>
-        <w:t xml:space="preserve">(g). Ni + AgNO</w:t>
-      </w:r>
-      <w:r>
-        <w:rPr>
-          <w:rFonts w:ascii="Times New Roman" w:hAnsi="Times New Roman" w:cs="Times New Roman"/>
-          <w:vertAlign w:val="subscript"/>
-          <w:lang w:val="tr-TR"/>
-        </w:rPr>
-        <w:t xml:space="preserve">3</w:t>
-      </w:r>
-      <w:r>
-        <w:rPr>
-          <w:rFonts w:ascii="Times New Roman" w:hAnsi="Times New Roman" w:cs="Times New Roman"/>
-          <w:lang w:val="tr-TR"/>
-        </w:rPr>
-        <w:t xml:space="preserve">: Gerçekleşir; Ni(k) + 2Ag</w:t>
+        <w:t xml:space="preserve">(suda) + 2e</w:t>
+      </w:r>
+      <w:r>
+        <w:rPr>
+          <w:rFonts w:ascii="Times New Roman" w:hAnsi="Times New Roman" w:cs="Times New Roman"/>
+          <w:vertAlign w:val="superscript"/>
+          <w:lang w:val="tr-TR"/>
+        </w:rPr>
+        <w:t xml:space="preserve">−</w:t>
+      </w:r>
+      <w:r>
+        <w:rPr>
+          <w:rFonts w:ascii="Times New Roman" w:hAnsi="Times New Roman" w:cs="Times New Roman"/>
+          <w:lang w:val="tr-TR"/>
+        </w:rPr>
+        <w:t xml:space="preserve"> → 2Ag(k). Kap aşınır, çözeltide Cu</w:t>
+      </w:r>
+      <w:r>
+        <w:rPr>
+          <w:rFonts w:ascii="Times New Roman" w:hAnsi="Times New Roman" w:cs="Times New Roman"/>
+          <w:vertAlign w:val="superscript"/>
+          <w:lang w:val="tr-TR"/>
+        </w:rPr>
+        <w:t xml:space="preserve">2+</w:t>
+      </w:r>
+      <w:r>
+        <w:rPr>
+          <w:rFonts w:ascii="Times New Roman" w:hAnsi="Times New Roman" w:cs="Times New Roman"/>
+          <w:lang w:val="tr-TR"/>
+        </w:rPr>
+        <w:t xml:space="preserve"> oluşur.</w:t>
+      </w:r>
+    </w:p>
+    <w:p>
+      <w:pPr>
+        <w:jc w:val="both"/>
+        <w:rPr>
+          <w:rFonts w:ascii="Times New Roman" w:hAnsi="Times New Roman" w:cs="Times New Roman"/>
+          <w:lang w:val="tr-TR"/>
+        </w:rPr>
+      </w:pPr>
+      <w:r>
+        <w:rPr>
+          <w:rFonts w:ascii="Times New Roman" w:hAnsi="Times New Roman" w:cs="Times New Roman"/>
+          <w:lang w:val="tr-TR"/>
+        </w:rPr>
+        <w:t xml:space="preserve">4. Cu + 2Ag</w:t>
       </w:r>
       <w:r>
         <w:rPr>
@@ -1888,7 +2131,7 @@
           <w:rFonts w:ascii="Times New Roman" w:hAnsi="Times New Roman" w:cs="Times New Roman"/>
           <w:lang w:val="tr-TR"/>
         </w:rPr>
-        <w:t xml:space="preserve">(suda) → Ni</w:t>
+        <w:t xml:space="preserve"> → Cu</w:t>
       </w:r>
       <w:r>
         <w:rPr>
@@ -1903,29 +2146,44 @@
           <w:rFonts w:ascii="Times New Roman" w:hAnsi="Times New Roman" w:cs="Times New Roman"/>
           <w:lang w:val="tr-TR"/>
         </w:rPr>
-        <w:t xml:space="preserve">(suda) + 2Ag(k).</w:t>
-      </w:r>
-    </w:p>
-    <w:p>
-      <w:pPr>
-        <w:jc w:val="both"/>
-        <w:rPr>
-          <w:rFonts w:ascii="Times New Roman" w:hAnsi="Times New Roman" w:cs="Times New Roman"/>
-          <w:lang w:val="tr-TR"/>
-        </w:rPr>
-      </w:pPr>
-      <w:r>
-        <w:rPr>
-          <w:rFonts w:ascii="Times New Roman" w:hAnsi="Times New Roman" w:cs="Times New Roman"/>
-          <w:lang w:val="tr-TR"/>
-        </w:rPr>
-        <w:t xml:space="preserve">2. D &gt; B &gt; A &gt; C. D, A</w:t>
-      </w:r>
-      <w:r>
-        <w:rPr>
-          <w:rFonts w:ascii="Times New Roman" w:hAnsi="Times New Roman" w:cs="Times New Roman"/>
-          <w:vertAlign w:val="superscript"/>
-          <w:lang w:val="tr-TR"/>
+        <w:t xml:space="preserve"> + 2Ag. 1 mol Cu tepkimeye girdiğinde kütle 2 · 108 − 64 = 152 g artar. Artış 21,52 − 20,00 = 1,52 g. a) n(Cu) = 1,52/152 = 0,010 mol. b) n(Ag) = 0,020 mol; m(Ag) = 0,020 · 108 = 2,16 g.</w:t>
+      </w:r>
+    </w:p>
+    <w:p>
+      <w:pPr>
+        <w:jc w:val="both"/>
+        <w:rPr>
+          <w:rFonts w:ascii="Times New Roman" w:hAnsi="Times New Roman" w:cs="Times New Roman"/>
+          <w:lang w:val="tr-TR"/>
+        </w:rPr>
+      </w:pPr>
+      <w:r>
+        <w:rPr>
+          <w:rFonts w:ascii="Times New Roman" w:hAnsi="Times New Roman" w:cs="Times New Roman"/>
+          <w:lang w:val="tr-TR"/>
+        </w:rPr>
+        <w:t xml:space="preserve">5. Önerme geçerli değildir. Gümüşün birinci iyonlaşma enerjisi (731 kJ/mol) çinkonunkinden (906 kJ/mol) küçük olduğu hâlde gümüş, aktiflik dizisinde çinkonun çok altında yer alır; çinko Ag</w:t>
+      </w:r>
+      <w:r>
+        <w:rPr>
+          <w:rFonts w:ascii="Times New Roman" w:hAnsi="Times New Roman" w:cs="Times New Roman"/>
+          <w:lang w:val="tr-TR"/>
+          <w:vertAlign w:val="superscript"/>
+        </w:rPr>
+        <w:t xml:space="preserve">+</w:t>
+      </w:r>
+      <w:r>
+        <w:rPr>
+          <w:rFonts w:ascii="Times New Roman" w:hAnsi="Times New Roman" w:cs="Times New Roman"/>
+          <w:lang w:val="tr-TR"/>
+        </w:rPr>
+        <w:t xml:space="preserve"> iyonlarını indirgeyebilirken gümüş Zn</w:t>
+      </w:r>
+      <w:r>
+        <w:rPr>
+          <w:rFonts w:ascii="Times New Roman" w:hAnsi="Times New Roman" w:cs="Times New Roman"/>
+          <w:lang w:val="tr-TR"/>
+          <w:vertAlign w:val="superscript"/>
         </w:rPr>
         <w:t xml:space="preserve">2+</w:t>
       </w:r>
@@ -1934,235 +2192,7 @@
           <w:rFonts w:ascii="Times New Roman" w:hAnsi="Times New Roman" w:cs="Times New Roman"/>
           <w:lang w:val="tr-TR"/>
         </w:rPr>
-        <w:t xml:space="preserve">, B</w:t>
-      </w:r>
-      <w:r>
-        <w:rPr>
-          <w:rFonts w:ascii="Times New Roman" w:hAnsi="Times New Roman" w:cs="Times New Roman"/>
-          <w:vertAlign w:val="superscript"/>
-          <w:lang w:val="tr-TR"/>
-        </w:rPr>
-        <w:t xml:space="preserve">2+</w:t>
-      </w:r>
-      <w:r>
-        <w:rPr>
-          <w:rFonts w:ascii="Times New Roman" w:hAnsi="Times New Roman" w:cs="Times New Roman"/>
-          <w:lang w:val="tr-TR"/>
-        </w:rPr>
-        <w:t xml:space="preserve"> ve C</w:t>
-      </w:r>
-      <w:r>
-        <w:rPr>
-          <w:rFonts w:ascii="Times New Roman" w:hAnsi="Times New Roman" w:cs="Times New Roman"/>
-          <w:vertAlign w:val="superscript"/>
-          <w:lang w:val="tr-TR"/>
-        </w:rPr>
-        <w:t xml:space="preserve">2+</w:t>
-      </w:r>
-      <w:r>
-        <w:rPr>
-          <w:rFonts w:ascii="Times New Roman" w:hAnsi="Times New Roman" w:cs="Times New Roman"/>
-          <w:lang w:val="tr-TR"/>
-        </w:rPr>
-        <w:t xml:space="preserve"> iyonlarının hepsini; B, A</w:t>
-      </w:r>
-      <w:r>
-        <w:rPr>
-          <w:rFonts w:ascii="Times New Roman" w:hAnsi="Times New Roman" w:cs="Times New Roman"/>
-          <w:vertAlign w:val="superscript"/>
-          <w:lang w:val="tr-TR"/>
-        </w:rPr>
-        <w:t xml:space="preserve">2+</w:t>
-      </w:r>
-      <w:r>
-        <w:rPr>
-          <w:rFonts w:ascii="Times New Roman" w:hAnsi="Times New Roman" w:cs="Times New Roman"/>
-          <w:lang w:val="tr-TR"/>
-        </w:rPr>
-        <w:t xml:space="preserve"> ve C</w:t>
-      </w:r>
-      <w:r>
-        <w:rPr>
-          <w:rFonts w:ascii="Times New Roman" w:hAnsi="Times New Roman" w:cs="Times New Roman"/>
-          <w:vertAlign w:val="superscript"/>
-          <w:lang w:val="tr-TR"/>
-        </w:rPr>
-        <w:t xml:space="preserve">2+</w:t>
-      </w:r>
-      <w:r>
-        <w:rPr>
-          <w:rFonts w:ascii="Times New Roman" w:hAnsi="Times New Roman" w:cs="Times New Roman"/>
-          <w:lang w:val="tr-TR"/>
-        </w:rPr>
-        <w:t xml:space="preserve"> iyonlarını; A yalnızca C</w:t>
-      </w:r>
-      <w:r>
-        <w:rPr>
-          <w:rFonts w:ascii="Times New Roman" w:hAnsi="Times New Roman" w:cs="Times New Roman"/>
-          <w:vertAlign w:val="superscript"/>
-          <w:lang w:val="tr-TR"/>
-        </w:rPr>
-        <w:t xml:space="preserve">2+</w:t>
-      </w:r>
-      <w:r>
-        <w:rPr>
-          <w:rFonts w:ascii="Times New Roman" w:hAnsi="Times New Roman" w:cs="Times New Roman"/>
-          <w:lang w:val="tr-TR"/>
-        </w:rPr>
-        <w:t xml:space="preserve"> iyonlarını indirger; C hiçbirini indirgemez. HCl verisine göre D, B, A hidrojenin üstünde, C altındadır: D &gt; B &gt; A &gt; H &gt; C.</w:t>
-      </w:r>
-    </w:p>
-    <w:p>
-      <w:pPr>
-        <w:jc w:val="both"/>
-        <w:rPr>
-          <w:rFonts w:ascii="Times New Roman" w:hAnsi="Times New Roman" w:cs="Times New Roman"/>
-          <w:lang w:val="tr-TR"/>
-        </w:rPr>
-      </w:pPr>
-      <w:r>
-        <w:rPr>
-          <w:rFonts w:ascii="Times New Roman" w:hAnsi="Times New Roman" w:cs="Times New Roman"/>
-          <w:lang w:val="tr-TR"/>
-        </w:rPr>
-        <w:t xml:space="preserve">3. Saklanamaz. Bakır gümüşten aktiftir: Cu(k) → Cu</w:t>
-      </w:r>
-      <w:r>
-        <w:rPr>
-          <w:rFonts w:ascii="Times New Roman" w:hAnsi="Times New Roman" w:cs="Times New Roman"/>
-          <w:vertAlign w:val="superscript"/>
-          <w:lang w:val="tr-TR"/>
-        </w:rPr>
-        <w:t xml:space="preserve">2+</w:t>
-      </w:r>
-      <w:r>
-        <w:rPr>
-          <w:rFonts w:ascii="Times New Roman" w:hAnsi="Times New Roman" w:cs="Times New Roman"/>
-          <w:lang w:val="tr-TR"/>
-        </w:rPr>
-        <w:t xml:space="preserve">(suda) + 2e</w:t>
-      </w:r>
-      <w:r>
-        <w:rPr>
-          <w:rFonts w:ascii="Times New Roman" w:hAnsi="Times New Roman" w:cs="Times New Roman"/>
-          <w:vertAlign w:val="superscript"/>
-          <w:lang w:val="tr-TR"/>
-        </w:rPr>
-        <w:t xml:space="preserve">−</w:t>
-      </w:r>
-      <w:r>
-        <w:rPr>
-          <w:rFonts w:ascii="Times New Roman" w:hAnsi="Times New Roman" w:cs="Times New Roman"/>
-          <w:lang w:val="tr-TR"/>
-        </w:rPr>
-        <w:t xml:space="preserve">; 2Ag</w:t>
-      </w:r>
-      <w:r>
-        <w:rPr>
-          <w:rFonts w:ascii="Times New Roman" w:hAnsi="Times New Roman" w:cs="Times New Roman"/>
-          <w:vertAlign w:val="superscript"/>
-          <w:lang w:val="tr-TR"/>
-        </w:rPr>
-        <w:t xml:space="preserve">+</w:t>
-      </w:r>
-      <w:r>
-        <w:rPr>
-          <w:rFonts w:ascii="Times New Roman" w:hAnsi="Times New Roman" w:cs="Times New Roman"/>
-          <w:lang w:val="tr-TR"/>
-        </w:rPr>
-        <w:t xml:space="preserve">(suda) + 2e</w:t>
-      </w:r>
-      <w:r>
-        <w:rPr>
-          <w:rFonts w:ascii="Times New Roman" w:hAnsi="Times New Roman" w:cs="Times New Roman"/>
-          <w:vertAlign w:val="superscript"/>
-          <w:lang w:val="tr-TR"/>
-        </w:rPr>
-        <w:t xml:space="preserve">−</w:t>
-      </w:r>
-      <w:r>
-        <w:rPr>
-          <w:rFonts w:ascii="Times New Roman" w:hAnsi="Times New Roman" w:cs="Times New Roman"/>
-          <w:lang w:val="tr-TR"/>
-        </w:rPr>
-        <w:t xml:space="preserve"> → 2Ag(k). Kap aşınır, çözeltide Cu</w:t>
-      </w:r>
-      <w:r>
-        <w:rPr>
-          <w:rFonts w:ascii="Times New Roman" w:hAnsi="Times New Roman" w:cs="Times New Roman"/>
-          <w:vertAlign w:val="superscript"/>
-          <w:lang w:val="tr-TR"/>
-        </w:rPr>
-        <w:t xml:space="preserve">2+</w:t>
-      </w:r>
-      <w:r>
-        <w:rPr>
-          <w:rFonts w:ascii="Times New Roman" w:hAnsi="Times New Roman" w:cs="Times New Roman"/>
-          <w:lang w:val="tr-TR"/>
-        </w:rPr>
-        <w:t xml:space="preserve"> oluşur.</w:t>
-      </w:r>
-    </w:p>
-    <w:p>
-      <w:pPr>
-        <w:jc w:val="both"/>
-        <w:rPr>
-          <w:rFonts w:ascii="Times New Roman" w:hAnsi="Times New Roman" w:cs="Times New Roman"/>
-          <w:lang w:val="tr-TR"/>
-        </w:rPr>
-      </w:pPr>
-      <w:r>
-        <w:rPr>
-          <w:rFonts w:ascii="Times New Roman" w:hAnsi="Times New Roman" w:cs="Times New Roman"/>
-          <w:lang w:val="tr-TR"/>
-        </w:rPr>
-        <w:t xml:space="preserve">4. Cu + 2Ag</w:t>
-      </w:r>
-      <w:r>
-        <w:rPr>
-          <w:rFonts w:ascii="Times New Roman" w:hAnsi="Times New Roman" w:cs="Times New Roman"/>
-          <w:vertAlign w:val="superscript"/>
-          <w:lang w:val="tr-TR"/>
-        </w:rPr>
-        <w:t xml:space="preserve">+</w:t>
-      </w:r>
-      <w:r>
-        <w:rPr>
-          <w:rFonts w:ascii="Times New Roman" w:hAnsi="Times New Roman" w:cs="Times New Roman"/>
-          <w:lang w:val="tr-TR"/>
-        </w:rPr>
-        <w:t xml:space="preserve"> → Cu</w:t>
-      </w:r>
-      <w:r>
-        <w:rPr>
-          <w:rFonts w:ascii="Times New Roman" w:hAnsi="Times New Roman" w:cs="Times New Roman"/>
-          <w:vertAlign w:val="superscript"/>
-          <w:lang w:val="tr-TR"/>
-        </w:rPr>
-        <w:t xml:space="preserve">2+</w:t>
-      </w:r>
-      <w:r>
-        <w:rPr>
-          <w:rFonts w:ascii="Times New Roman" w:hAnsi="Times New Roman" w:cs="Times New Roman"/>
-          <w:lang w:val="tr-TR"/>
-        </w:rPr>
-        <w:t xml:space="preserve"> + 2Ag. 1 mol Cu tepkimeye girdiğinde kütle 2 · 108 − 64 = 152 g artar. Artış 21,52 − 20,00 = 1,52 g. a) n(Cu) = 1,52/152 = 0,010 mol. b) n(Ag) = 0,020 mol; m(Ag) = 0,020 · 108 = 2,16 g.</w:t>
-      </w:r>
-    </w:p>
-    <w:p>
-      <w:pPr>
-        <w:jc w:val="both"/>
-        <w:rPr>
-          <w:rFonts w:ascii="Times New Roman" w:hAnsi="Times New Roman" w:cs="Times New Roman"/>
-          <w:lang w:val="tr-TR"/>
-        </w:rPr>
-      </w:pPr>
-      <w:r>
-        <w:rPr>
-          <w:rFonts w:ascii="Times New Roman" w:hAnsi="Times New Roman" w:cs="Times New Roman"/>
-          <w:lang w:val="tr-TR"/>
-        </w:rPr>
-        <w:t xml:space="preserve">5. Önerme geçerli değildir. Kurşunun birinci iyonlaşma enerjisi (716 kJ/mol) çinkonunkinden (906 kJ/mol) küçük olduğu hâlde deneyde çinko kurşun(II) iyonlarını indirgemiş, kurşun çinko iyonlarını indirgeyememiştir. Sulu çözeltideki aktiflik, kristalden ayrılma enerjisi ve iyonların su molekülleriyle etkileşimine de bağlıdır.</w:t>
+        <w:t xml:space="preserve"> iyonlarını indirgeyemez. Sulu çözeltideki aktiflik, kristalden ayrılma enerjisi ve iyonların su molekülleriyle etkileşimine de bağlıdır.</w:t>
       </w:r>
     </w:p>
     <w:p>
@@ -3437,8 +3467,8 @@
       <w:r>
         <w:rPr>
           <w:rFonts w:ascii="Times New Roman" w:hAnsi="Times New Roman" w:cs="Times New Roman"/>
-          <w:vertAlign w:val="superscript"/>
-          <w:lang w:val="tr-TR"/>
+          <w:lang w:val="tr-TR"/>
+          <w:vertAlign w:val="superscript"/>
         </w:rPr>
         <w:t xml:space="preserve">2+</w:t>
       </w:r>
@@ -3447,28 +3477,43 @@
           <w:rFonts w:ascii="Times New Roman" w:hAnsi="Times New Roman" w:cs="Times New Roman"/>
           <w:lang w:val="tr-TR"/>
         </w:rPr>
-        <w:t xml:space="preserve"> || Ag</w:t>
-      </w:r>
-      <w:r>
-        <w:rPr>
-          <w:rFonts w:ascii="Times New Roman" w:hAnsi="Times New Roman" w:cs="Times New Roman"/>
-          <w:vertAlign w:val="superscript"/>
-          <w:lang w:val="tr-TR"/>
-        </w:rPr>
-        <w:t xml:space="preserve">+</w:t>
-      </w:r>
-      <w:r>
-        <w:rPr>
-          <w:rFonts w:ascii="Times New Roman" w:hAnsi="Times New Roman" w:cs="Times New Roman"/>
-          <w:lang w:val="tr-TR"/>
-        </w:rPr>
-        <w:t xml:space="preserve"> | Ag; E° = 0,80 − (−2,37) = 3,17 V. En küçük: Cu | Cu</w:t>
-      </w:r>
-      <w:r>
-        <w:rPr>
-          <w:rFonts w:ascii="Times New Roman" w:hAnsi="Times New Roman" w:cs="Times New Roman"/>
-          <w:vertAlign w:val="superscript"/>
-          <w:lang w:val="tr-TR"/>
+        <w:t xml:space="preserve"> || Au</w:t>
+      </w:r>
+      <w:r>
+        <w:rPr>
+          <w:rFonts w:ascii="Times New Roman" w:hAnsi="Times New Roman" w:cs="Times New Roman"/>
+          <w:lang w:val="tr-TR"/>
+          <w:vertAlign w:val="superscript"/>
+        </w:rPr>
+        <w:t xml:space="preserve">3+</w:t>
+      </w:r>
+      <w:r>
+        <w:rPr>
+          <w:rFonts w:ascii="Times New Roman" w:hAnsi="Times New Roman" w:cs="Times New Roman"/>
+          <w:lang w:val="tr-TR"/>
+        </w:rPr>
+        <w:t xml:space="preserve"> | Au; E° = 1,50 − (−2,37) = 3,87 V (net: 3Mg + 2Au</w:t>
+      </w:r>
+      <w:r>
+        <w:rPr>
+          <w:rFonts w:ascii="Times New Roman" w:hAnsi="Times New Roman" w:cs="Times New Roman"/>
+          <w:lang w:val="tr-TR"/>
+          <w:vertAlign w:val="superscript"/>
+        </w:rPr>
+        <w:t xml:space="preserve">3+</w:t>
+      </w:r>
+      <w:r>
+        <w:rPr>
+          <w:rFonts w:ascii="Times New Roman" w:hAnsi="Times New Roman" w:cs="Times New Roman"/>
+          <w:lang w:val="tr-TR"/>
+        </w:rPr>
+        <w:t xml:space="preserve"> → 3Mg</w:t>
+      </w:r>
+      <w:r>
+        <w:rPr>
+          <w:rFonts w:ascii="Times New Roman" w:hAnsi="Times New Roman" w:cs="Times New Roman"/>
+          <w:lang w:val="tr-TR"/>
+          <w:vertAlign w:val="superscript"/>
         </w:rPr>
         <w:t xml:space="preserve">2+</w:t>
       </w:r>
@@ -3477,22 +3522,37 @@
           <w:rFonts w:ascii="Times New Roman" w:hAnsi="Times New Roman" w:cs="Times New Roman"/>
           <w:lang w:val="tr-TR"/>
         </w:rPr>
-        <w:t xml:space="preserve"> || Ag</w:t>
-      </w:r>
-      <w:r>
-        <w:rPr>
-          <w:rFonts w:ascii="Times New Roman" w:hAnsi="Times New Roman" w:cs="Times New Roman"/>
-          <w:vertAlign w:val="superscript"/>
-          <w:lang w:val="tr-TR"/>
-        </w:rPr>
-        <w:t xml:space="preserve">+</w:t>
-      </w:r>
-      <w:r>
-        <w:rPr>
-          <w:rFonts w:ascii="Times New Roman" w:hAnsi="Times New Roman" w:cs="Times New Roman"/>
-          <w:lang w:val="tr-TR"/>
-        </w:rPr>
-        <w:t xml:space="preserve"> | Ag; E° = 0,80 − 0,34 = 0,46 V.</w:t>
+        <w:t xml:space="preserve"> + 2Au). En küçük: Ni | Ni</w:t>
+      </w:r>
+      <w:r>
+        <w:rPr>
+          <w:rFonts w:ascii="Times New Roman" w:hAnsi="Times New Roman" w:cs="Times New Roman"/>
+          <w:lang w:val="tr-TR"/>
+          <w:vertAlign w:val="superscript"/>
+        </w:rPr>
+        <w:t xml:space="preserve">2+</w:t>
+      </w:r>
+      <w:r>
+        <w:rPr>
+          <w:rFonts w:ascii="Times New Roman" w:hAnsi="Times New Roman" w:cs="Times New Roman"/>
+          <w:lang w:val="tr-TR"/>
+        </w:rPr>
+        <w:t xml:space="preserve"> || Pb</w:t>
+      </w:r>
+      <w:r>
+        <w:rPr>
+          <w:rFonts w:ascii="Times New Roman" w:hAnsi="Times New Roman" w:cs="Times New Roman"/>
+          <w:lang w:val="tr-TR"/>
+          <w:vertAlign w:val="superscript"/>
+        </w:rPr>
+        <w:t xml:space="preserve">2+</w:t>
+      </w:r>
+      <w:r>
+        <w:rPr>
+          <w:rFonts w:ascii="Times New Roman" w:hAnsi="Times New Roman" w:cs="Times New Roman"/>
+          <w:lang w:val="tr-TR"/>
+        </w:rPr>
+        <w:t xml:space="preserve"> | Pb; E° = −0,13 − (−0,25) = 0,12 V.</w:t>
       </w:r>
     </w:p>
     <w:p>
@@ -3723,8 +3783,8 @@
       <w:r>
         <w:rPr>
           <w:rFonts w:ascii="Times New Roman" w:hAnsi="Times New Roman" w:cs="Times New Roman"/>
-          <w:vertAlign w:val="superscript"/>
-          <w:lang w:val="tr-TR"/>
+          <w:lang w:val="tr-TR"/>
+          <w:vertAlign w:val="superscript"/>
         </w:rPr>
         <w:t xml:space="preserve">2+</w:t>
       </w:r>
@@ -3733,13 +3793,13 @@
           <w:rFonts w:ascii="Times New Roman" w:hAnsi="Times New Roman" w:cs="Times New Roman"/>
           <w:lang w:val="tr-TR"/>
         </w:rPr>
-        <w:t xml:space="preserve">] tepken artar)  b) Artar ([Zn</w:t>
-      </w:r>
-      <w:r>
-        <w:rPr>
-          <w:rFonts w:ascii="Times New Roman" w:hAnsi="Times New Roman" w:cs="Times New Roman"/>
-          <w:vertAlign w:val="superscript"/>
-          <w:lang w:val="tr-TR"/>
+        <w:t xml:space="preserve">] tepken artar)  b) Artar ([Fe</w:t>
+      </w:r>
+      <w:r>
+        <w:rPr>
+          <w:rFonts w:ascii="Times New Roman" w:hAnsi="Times New Roman" w:cs="Times New Roman"/>
+          <w:lang w:val="tr-TR"/>
+          <w:vertAlign w:val="superscript"/>
         </w:rPr>
         <w:t xml:space="preserve">2+</w:t>
       </w:r>
@@ -3753,8 +3813,8 @@
       <w:r>
         <w:rPr>
           <w:rFonts w:ascii="Times New Roman" w:hAnsi="Times New Roman" w:cs="Times New Roman"/>
-          <w:vertAlign w:val="superscript"/>
-          <w:lang w:val="tr-TR"/>
+          <w:lang w:val="tr-TR"/>
+          <w:vertAlign w:val="superscript"/>
         </w:rPr>
         <w:t xml:space="preserve">2+</w:t>
       </w:r>
@@ -3779,13 +3839,13 @@
           <w:rFonts w:ascii="Times New Roman" w:hAnsi="Times New Roman" w:cs="Times New Roman"/>
           <w:lang w:val="tr-TR"/>
         </w:rPr>
-        <w:t xml:space="preserve">2. B &gt; A = D &gt; C. B’de ürün (Zn</w:t>
-      </w:r>
-      <w:r>
-        <w:rPr>
-          <w:rFonts w:ascii="Times New Roman" w:hAnsi="Times New Roman" w:cs="Times New Roman"/>
-          <w:vertAlign w:val="superscript"/>
-          <w:lang w:val="tr-TR"/>
+        <w:t xml:space="preserve">2. B &gt; A = D &gt; C. B’de ürün (Pb</w:t>
+      </w:r>
+      <w:r>
+        <w:rPr>
+          <w:rFonts w:ascii="Times New Roman" w:hAnsi="Times New Roman" w:cs="Times New Roman"/>
+          <w:lang w:val="tr-TR"/>
+          <w:vertAlign w:val="superscript"/>
         </w:rPr>
         <w:t xml:space="preserve">2+</w:t>
       </w:r>
@@ -3794,13 +3854,13 @@
           <w:rFonts w:ascii="Times New Roman" w:hAnsi="Times New Roman" w:cs="Times New Roman"/>
           <w:lang w:val="tr-TR"/>
         </w:rPr>
-        <w:t xml:space="preserve">) derişimi düşük olduğu için ileri yöndeki eğilim en fazladır; A ve D’de derişimlerin oranı aynıdır (1,10 V); C’de tepken (Cu</w:t>
-      </w:r>
-      <w:r>
-        <w:rPr>
-          <w:rFonts w:ascii="Times New Roman" w:hAnsi="Times New Roman" w:cs="Times New Roman"/>
-          <w:vertAlign w:val="superscript"/>
-          <w:lang w:val="tr-TR"/>
+        <w:t xml:space="preserve">) derişimi düşük olduğu için ileri yöndeki eğilim en fazladır; A ve D’de derişimlerin oranı aynıdır (0,47 V); C’de tepken (Cu</w:t>
+      </w:r>
+      <w:r>
+        <w:rPr>
+          <w:rFonts w:ascii="Times New Roman" w:hAnsi="Times New Roman" w:cs="Times New Roman"/>
+          <w:lang w:val="tr-TR"/>
+          <w:vertAlign w:val="superscript"/>
         </w:rPr>
         <w:t xml:space="preserve">2+</w:t>
       </w:r>
@@ -4940,13 +5000,66 @@
           <w:rFonts w:ascii="Times New Roman" w:hAnsi="Times New Roman" w:cs="Times New Roman"/>
           <w:lang w:val="tr-TR"/>
         </w:rPr>
-        <w:t xml:space="preserve">3. Katotta H</w:t>
-      </w:r>
-      <w:r>
-        <w:rPr>
-          <w:rFonts w:ascii="Times New Roman" w:hAnsi="Times New Roman" w:cs="Times New Roman"/>
+        <w:t xml:space="preserve">3. K</w:t>
+      </w:r>
+      <w:r>
+        <w:rPr>
+          <w:rFonts w:ascii="Times New Roman" w:hAnsi="Times New Roman" w:cs="Times New Roman"/>
+          <w:lang w:val="tr-TR"/>
+          <w:vertAlign w:val="superscript"/>
+        </w:rPr>
+        <w:t xml:space="preserve">+</w:t>
+      </w:r>
+      <w:r>
+        <w:rPr>
+          <w:rFonts w:ascii="Times New Roman" w:hAnsi="Times New Roman" w:cs="Times New Roman"/>
+          <w:lang w:val="tr-TR"/>
+        </w:rPr>
+        <w:t xml:space="preserve"> iyonlarının indirgenme potansiyeli (−2,93 V) suyunkinden (−0,83 V) çok küçük olduğu için katotta K</w:t>
+      </w:r>
+      <w:r>
+        <w:rPr>
+          <w:rFonts w:ascii="Times New Roman" w:hAnsi="Times New Roman" w:cs="Times New Roman"/>
+          <w:lang w:val="tr-TR"/>
+          <w:vertAlign w:val="superscript"/>
+        </w:rPr>
+        <w:t xml:space="preserve">+</w:t>
+      </w:r>
+      <w:r>
+        <w:rPr>
+          <w:rFonts w:ascii="Times New Roman" w:hAnsi="Times New Roman" w:cs="Times New Roman"/>
+          <w:lang w:val="tr-TR"/>
+        </w:rPr>
+        <w:t xml:space="preserve"> yerine su indirgenir; NO</w:t>
+      </w:r>
+      <w:r>
+        <w:rPr>
+          <w:rFonts w:ascii="Times New Roman" w:hAnsi="Times New Roman" w:cs="Times New Roman"/>
+          <w:lang w:val="tr-TR"/>
           <w:vertAlign w:val="subscript"/>
-          <w:lang w:val="tr-TR"/>
+        </w:rPr>
+        <w:t xml:space="preserve">3</w:t>
+      </w:r>
+      <w:r>
+        <w:rPr>
+          <w:rFonts w:ascii="Times New Roman" w:hAnsi="Times New Roman" w:cs="Times New Roman"/>
+          <w:lang w:val="tr-TR"/>
+          <w:vertAlign w:val="superscript"/>
+        </w:rPr>
+        <w:t xml:space="preserve">−</w:t>
+      </w:r>
+      <w:r>
+        <w:rPr>
+          <w:rFonts w:ascii="Times New Roman" w:hAnsi="Times New Roman" w:cs="Times New Roman"/>
+          <w:lang w:val="tr-TR"/>
+        </w:rPr>
+        <w:t xml:space="preserve"> iyonları da değişime uğramaz ve su elektroliz olur. Katotta H</w:t>
+      </w:r>
+      <w:r>
+        <w:rPr>
+          <w:rFonts w:ascii="Times New Roman" w:hAnsi="Times New Roman" w:cs="Times New Roman"/>
+          <w:lang w:val="tr-TR"/>
+          <w:vertAlign w:val="subscript"/>
         </w:rPr>
         <w:t xml:space="preserve">2</w:t>
       </w:r>
@@ -4960,8 +5073,8 @@
       <w:r>
         <w:rPr>
           <w:rFonts w:ascii="Times New Roman" w:hAnsi="Times New Roman" w:cs="Times New Roman"/>
+          <w:lang w:val="tr-TR"/>
           <w:vertAlign w:val="subscript"/>
-          <w:lang w:val="tr-TR"/>
         </w:rPr>
         <w:t xml:space="preserve">2</w:t>
       </w:r>
@@ -4975,8 +5088,8 @@
       <w:r>
         <w:rPr>
           <w:rFonts w:ascii="Times New Roman" w:hAnsi="Times New Roman" w:cs="Times New Roman"/>
+          <w:lang w:val="tr-TR"/>
           <w:vertAlign w:val="subscript"/>
-          <w:lang w:val="tr-TR"/>
         </w:rPr>
         <w:t xml:space="preserve">2</w:t>
       </w:r>
@@ -4990,8 +5103,8 @@
       <w:r>
         <w:rPr>
           <w:rFonts w:ascii="Times New Roman" w:hAnsi="Times New Roman" w:cs="Times New Roman"/>
+          <w:lang w:val="tr-TR"/>
           <w:vertAlign w:val="subscript"/>
-          <w:lang w:val="tr-TR"/>
         </w:rPr>
         <w:t xml:space="preserve">2</w:t>
       </w:r>
@@ -5005,8 +5118,8 @@
       <w:r>
         <w:rPr>
           <w:rFonts w:ascii="Times New Roman" w:hAnsi="Times New Roman" w:cs="Times New Roman"/>
+          <w:lang w:val="tr-TR"/>
           <w:vertAlign w:val="subscript"/>
-          <w:lang w:val="tr-TR"/>
         </w:rPr>
         <w:t xml:space="preserve">2</w:t>
       </w:r>
@@ -5020,8 +5133,8 @@
       <w:r>
         <w:rPr>
           <w:rFonts w:ascii="Times New Roman" w:hAnsi="Times New Roman" w:cs="Times New Roman"/>
+          <w:lang w:val="tr-TR"/>
           <w:vertAlign w:val="subscript"/>
-          <w:lang w:val="tr-TR"/>
         </w:rPr>
         <w:t xml:space="preserve">2</w:t>
       </w:r>
@@ -5035,8 +5148,8 @@
       <w:r>
         <w:rPr>
           <w:rFonts w:ascii="Times New Roman" w:hAnsi="Times New Roman" w:cs="Times New Roman"/>
-          <w:vertAlign w:val="superscript"/>
-          <w:lang w:val="tr-TR"/>
+          <w:lang w:val="tr-TR"/>
+          <w:vertAlign w:val="superscript"/>
         </w:rPr>
         <w:t xml:space="preserve">−</w:t>
       </w:r>
@@ -5317,13 +5430,13 @@
           <w:rFonts w:ascii="Times New Roman" w:hAnsi="Times New Roman" w:cs="Times New Roman"/>
           <w:lang w:val="tr-TR"/>
         </w:rPr>
-        <w:t xml:space="preserve">2. Na &gt; Zn &gt; Al. Aynı yük geçtiğinden Na</w:t>
-      </w:r>
-      <w:r>
-        <w:rPr>
-          <w:rFonts w:ascii="Times New Roman" w:hAnsi="Times New Roman" w:cs="Times New Roman"/>
-          <w:vertAlign w:val="superscript"/>
-          <w:lang w:val="tr-TR"/>
+        <w:t xml:space="preserve">2. K &gt; Ca &gt; Al. Seri bağlı kaplardan aynı yük geçtiğinden K</w:t>
+      </w:r>
+      <w:r>
+        <w:rPr>
+          <w:rFonts w:ascii="Times New Roman" w:hAnsi="Times New Roman" w:cs="Times New Roman"/>
+          <w:lang w:val="tr-TR"/>
+          <w:vertAlign w:val="superscript"/>
         </w:rPr>
         <w:t xml:space="preserve">+</w:t>
       </w:r>
@@ -5332,13 +5445,13 @@
           <w:rFonts w:ascii="Times New Roman" w:hAnsi="Times New Roman" w:cs="Times New Roman"/>
           <w:lang w:val="tr-TR"/>
         </w:rPr>
-        <w:t xml:space="preserve"> bir, Zn</w:t>
-      </w:r>
-      <w:r>
-        <w:rPr>
-          <w:rFonts w:ascii="Times New Roman" w:hAnsi="Times New Roman" w:cs="Times New Roman"/>
-          <w:vertAlign w:val="superscript"/>
-          <w:lang w:val="tr-TR"/>
+        <w:t xml:space="preserve"> bir, Ca</w:t>
+      </w:r>
+      <w:r>
+        <w:rPr>
+          <w:rFonts w:ascii="Times New Roman" w:hAnsi="Times New Roman" w:cs="Times New Roman"/>
+          <w:lang w:val="tr-TR"/>
+          <w:vertAlign w:val="superscript"/>
         </w:rPr>
         <w:t xml:space="preserve">2+</w:t>
       </w:r>
@@ -5352,8 +5465,8 @@
       <w:r>
         <w:rPr>
           <w:rFonts w:ascii="Times New Roman" w:hAnsi="Times New Roman" w:cs="Times New Roman"/>
-          <w:vertAlign w:val="superscript"/>
-          <w:lang w:val="tr-TR"/>
+          <w:lang w:val="tr-TR"/>
+          <w:vertAlign w:val="superscript"/>
         </w:rPr>
         <w:t xml:space="preserve">3+</w:t>
       </w:r>
@@ -5362,29 +5475,29 @@
           <w:rFonts w:ascii="Times New Roman" w:hAnsi="Times New Roman" w:cs="Times New Roman"/>
           <w:lang w:val="tr-TR"/>
         </w:rPr>
-        <w:t xml:space="preserve"> üç elektron alır; mol sayıları 6 : 3 : 2 oranındadır.</w:t>
-      </w:r>
-    </w:p>
-    <w:p>
-      <w:pPr>
-        <w:jc w:val="both"/>
-        <w:rPr>
-          <w:rFonts w:ascii="Times New Roman" w:hAnsi="Times New Roman" w:cs="Times New Roman"/>
-          <w:lang w:val="tr-TR"/>
-        </w:rPr>
-      </w:pPr>
-      <w:r>
-        <w:rPr>
-          <w:rFonts w:ascii="Times New Roman" w:hAnsi="Times New Roman" w:cs="Times New Roman"/>
-          <w:lang w:val="tr-TR"/>
-        </w:rPr>
-        <w:t xml:space="preserve">3. Üç katına çıkar. Örneğin 20 dakikalık deneylerde akım 0,50 A’den 1,50 A’e çıktığında Cl</w:t>
-      </w:r>
-      <w:r>
-        <w:rPr>
-          <w:rFonts w:ascii="Times New Roman" w:hAnsi="Times New Roman" w:cs="Times New Roman"/>
+        <w:t xml:space="preserve"> üç elektron alır; oluşan metallerin mol sayıları 6 : 3 : 2 oranındadır.</w:t>
+      </w:r>
+    </w:p>
+    <w:p>
+      <w:pPr>
+        <w:jc w:val="both"/>
+        <w:rPr>
+          <w:rFonts w:ascii="Times New Roman" w:hAnsi="Times New Roman" w:cs="Times New Roman"/>
+          <w:lang w:val="tr-TR"/>
+        </w:rPr>
+      </w:pPr>
+      <w:r>
+        <w:rPr>
+          <w:rFonts w:ascii="Times New Roman" w:hAnsi="Times New Roman" w:cs="Times New Roman"/>
+          <w:lang w:val="tr-TR"/>
+        </w:rPr>
+        <w:t xml:space="preserve">3. Üç katına çıkar. Süre sabitken akım üç katına çıktığında devreden geçen elektrik yükü de üç katına çıkar. Anotta açığa çıkan Cl</w:t>
+      </w:r>
+      <w:r>
+        <w:rPr>
+          <w:rFonts w:ascii="Times New Roman" w:hAnsi="Times New Roman" w:cs="Times New Roman"/>
+          <w:lang w:val="tr-TR"/>
           <w:vertAlign w:val="subscript"/>
-          <w:lang w:val="tr-TR"/>
         </w:rPr>
         <w:t xml:space="preserve">2</w:t>
       </w:r>
@@ -5393,7 +5506,7 @@
           <w:rFonts w:ascii="Times New Roman" w:hAnsi="Times New Roman" w:cs="Times New Roman"/>
           <w:lang w:val="tr-TR"/>
         </w:rPr>
-        <w:t xml:space="preserve"> hacmi 77 mL’den 229 mL’ye yükselmiştir.</w:t>
+        <w:t xml:space="preserve"> miktarı geçen yükle doğru orantılı olduğundan klor gazı hacmi de üç katına çıkar.</w:t>
       </w:r>
     </w:p>
     <w:p>
@@ -5612,7 +5725,7 @@
           <w:rFonts w:ascii="Times New Roman" w:hAnsi="Times New Roman" w:cs="Times New Roman"/>
           <w:lang w:val="tr-TR"/>
         </w:rPr>
-        <w:t xml:space="preserve"> harcandıkça mavi renk açılırdı. Süre ya da akım iki katına çıktığında biriken bakır yaklaşık iki katına çıkar (Faraday yasası). Kaplama kalınlığı ve galvanizleme, nikel, krom kaplama: Öğrenci özgün cevabını oluşturur.</w:t>
+        <w:t xml:space="preserve"> harcandıkça mavi renk açılırdı. Akım ile sürenin çarpımı 1. denemede 6,0 A·dk, 2. ve 3. denemelerde 12 A·dk’dır. Bu çarpım iki katına çıktığında biriken bakır da yaklaşık iki katına çıkar (0,116 g → 0,233 g ve 0,231 g); 2. ve 3. denemelerde çarpım aynı olduğundan biriken bakır kütleleri yaklaşık eşittir (Faraday yasası). Kaplama kalınlığı ve galvanizleme, nikel, krom kaplama: Öğrenci özgün cevabını oluşturur.</w:t>
       </w:r>
     </w:p>
     <w:p>

</xml_diff>

<commit_message>
Harfli alt maddeler Turk alfabesiyle ve noktali bicime cevrildi (a. b. c. c. d.)
</commit_message>
<xml_diff>
--- a/CevapAnahtari/Kimya12-tema-1-cevaplar.docx
+++ b/CevapAnahtari/Kimya12-tema-1-cevaplar.docx
@@ -933,7 +933,7 @@
           <w:rFonts w:ascii="Times New Roman" w:hAnsi="Times New Roman" w:cs="Times New Roman"/>
           <w:lang w:val="tr-TR"/>
         </w:rPr>
-        <w:t xml:space="preserve">2. a) Çinko yüzeyinde koyu gri katı birikmesi, çözeltinin yeşil renginin açılması, çinkonun aşınması. b) Zn(k) → Zn</w:t>
+        <w:t xml:space="preserve">2. a. Çinko yüzeyinde koyu gri katı birikmesi, çözeltinin yeşil renginin açılması, çinkonun aşınması. b) Zn(k) → Zn</w:t>
       </w:r>
       <w:r>
         <w:rPr>
@@ -1160,7 +1160,7 @@
           <w:rFonts w:ascii="Times New Roman" w:hAnsi="Times New Roman" w:cs="Times New Roman"/>
           <w:lang w:val="tr-TR"/>
         </w:rPr>
-        <w:t xml:space="preserve">4. a) n(Mg) = 2,4/24 = 0,10 mol; aktarılan elektron = 0,10 · 2 = 0,20 mol. b) n(Cu) = 0,20/2 = 0,10 mol; m(Cu) = 0,10 · 64 = 6,4 g.</w:t>
+        <w:t xml:space="preserve">4. a. n(Mg) = 2,4/24 = 0,10 mol; aktarılan elektron = 0,10 · 2 = 0,20 mol. b) n(Cu) = 0,20/2 = 0,10 mol; m(Cu) = 0,10 · 64 = 6,4 g.</w:t>
       </w:r>
     </w:p>
     <w:p>
@@ -3010,7 +3010,7 @@
           <w:rFonts w:ascii="Times New Roman" w:hAnsi="Times New Roman" w:cs="Times New Roman"/>
           <w:lang w:val="tr-TR"/>
         </w:rPr>
-        <w:t xml:space="preserve">2. a) Gözleme dayalıdır (ölçüm aracıyla doğrudan okunmuştur). b) Gözleme dayalı değildir (elektron aktarımı doğrudan gözlenemez, çıkarımdır). c) Gözleme dayalıdır. d) Gözleme dayalı değildir (iyon göçü doğrudan gözlenemez, tahmindir).</w:t>
+        <w:t xml:space="preserve">2. a. Gözleme dayalıdır (ölçüm aracıyla doğrudan okunmuştur). b) Gözleme dayalı değildir (elektron aktarımı doğrudan gözlenemez, çıkarımdır). c) Gözleme dayalıdır. d) Gözleme dayalı değildir (iyon göçü doğrudan gözlenemez, tahmindir).</w:t>
       </w:r>
     </w:p>
     <w:p>
@@ -3423,7 +3423,7 @@
           <w:rFonts w:ascii="Times New Roman" w:hAnsi="Times New Roman" w:cs="Times New Roman"/>
           <w:lang w:val="tr-TR"/>
         </w:rPr>
-        <w:t xml:space="preserve">1. a) Mg + Cu</w:t>
+        <w:t xml:space="preserve">1. a. Mg + Cu</w:t>
       </w:r>
       <w:r>
         <w:rPr>
@@ -3453,7 +3453,7 @@
           <w:rFonts w:ascii="Times New Roman" w:hAnsi="Times New Roman" w:cs="Times New Roman"/>
           <w:lang w:val="tr-TR"/>
         </w:rPr>
-        <w:t xml:space="preserve"> + Cu; E° = 0,34 − (−2,37) = 2,71 V  b) Ni + 2Ag</w:t>
+        <w:t xml:space="preserve"> + Cu; E° = 0,34 − (−2,37) = 2,71 V  b. Ni + 2Ag</w:t>
       </w:r>
       <w:r>
         <w:rPr>
@@ -3483,7 +3483,7 @@
           <w:rFonts w:ascii="Times New Roman" w:hAnsi="Times New Roman" w:cs="Times New Roman"/>
           <w:lang w:val="tr-TR"/>
         </w:rPr>
-        <w:t xml:space="preserve"> + 2Ag; E° = 0,80 − (−0,25) = 1,05 V  c) Zn + Pb</w:t>
+        <w:t xml:space="preserve"> + 2Ag; E° = 0,80 − (−0,25) = 1,05 V  c. Zn + Pb</w:t>
       </w:r>
       <w:r>
         <w:rPr>
@@ -3529,7 +3529,7 @@
           <w:rFonts w:ascii="Times New Roman" w:hAnsi="Times New Roman" w:cs="Times New Roman"/>
           <w:lang w:val="tr-TR"/>
         </w:rPr>
-        <w:t xml:space="preserve">2. a) E° = −0,13 − (−0,44) = +0,31 V, istemli  b) E° = −0,25 − 0,80 = −1,05 V, istemsiz  c) E° = 1,36 − 1,07 = +0,29 V, istemli  d) Katot I</w:t>
+        <w:t xml:space="preserve">2. a. E° = −0,13 − (−0,44) = +0,31 V, istemli  b. E° = −0,25 − 0,80 = −1,05 V, istemsiz  c. E° = 1,36 − 1,07 = +0,29 V, istemli  ç. Katot I</w:t>
       </w:r>
       <w:r>
         <w:rPr>
@@ -3937,7 +3937,7 @@
           <w:rFonts w:ascii="Times New Roman" w:hAnsi="Times New Roman" w:cs="Times New Roman"/>
           <w:lang w:val="tr-TR"/>
         </w:rPr>
-        <w:t xml:space="preserve">1. a) Artar ([Cu</w:t>
+        <w:t xml:space="preserve">1. a. Artar ([Cu</w:t>
       </w:r>
       <w:r>
         <w:rPr>
@@ -3952,7 +3952,7 @@
           <w:rFonts w:ascii="Times New Roman" w:hAnsi="Times New Roman" w:cs="Times New Roman"/>
           <w:lang w:val="tr-TR"/>
         </w:rPr>
-        <w:t xml:space="preserve">] tepken artar)  b) Artar ([Fe</w:t>
+        <w:t xml:space="preserve">] tepken artar)  b. Artar ([Fe</w:t>
       </w:r>
       <w:r>
         <w:rPr>
@@ -3967,7 +3967,7 @@
           <w:rFonts w:ascii="Times New Roman" w:hAnsi="Times New Roman" w:cs="Times New Roman"/>
           <w:lang w:val="tr-TR"/>
         </w:rPr>
-        <w:t xml:space="preserve">] ürün azalır)  c) Azalır ([Cu</w:t>
+        <w:t xml:space="preserve">] ürün azalır)  c. Azalır ([Cu</w:t>
       </w:r>
       <w:r>
         <w:rPr>
@@ -3982,7 +3982,7 @@
           <w:rFonts w:ascii="Times New Roman" w:hAnsi="Times New Roman" w:cs="Times New Roman"/>
           <w:lang w:val="tr-TR"/>
         </w:rPr>
-        <w:t xml:space="preserve">] azalır)  d) Değişmez (yüzey alanı potansiyeli etkilemez)  e) Azalır (ekzotermik tepkime; sıcaklık artışı dengeyi tepkenler yönüne kaydırır)  f) Artar (Mg daha aktiftir; E° = 2,71 V)</w:t>
+        <w:t xml:space="preserve">] azalır)  ç. Değişmez (yüzey alanı potansiyeli etkilemez)  d. Azalır (ekzotermik tepkime; sıcaklık artışı dengeyi tepkenler yönüne kaydırır)  e. Artar (Mg daha aktiftir; E° = 2,71 V)</w:t>
       </w:r>
     </w:p>
     <w:p>
@@ -6615,7 +6615,7 @@
           <w:rFonts w:ascii="Times New Roman" w:hAnsi="Times New Roman" w:cs="Times New Roman"/>
           <w:lang w:val="tr-TR"/>
         </w:rPr>
-        <w:t xml:space="preserve">a) Şerit yüzeyinde gri kristallerin (katı) birikmesi, çinko şeridin incelmesi (aşınması) ve kütlesinin değişmesi.  b) Yükseltgenme: Zn(k) → Zn</w:t>
+        <w:t xml:space="preserve">a. Şerit yüzeyinde gri kristallerin (katı) birikmesi, çinko şeridin incelmesi (aşınması) ve kütlesinin değişmesi.  b. Yükseltgenme: Zn(k) → Zn</w:t>
       </w:r>
       <w:r>
         <w:rPr>
@@ -6705,7 +6705,7 @@
           <w:rFonts w:ascii="Times New Roman" w:hAnsi="Times New Roman" w:cs="Times New Roman"/>
           <w:lang w:val="tr-TR"/>
         </w:rPr>
-        <w:t xml:space="preserve">(suda) + Sn(k)  c) İndirgen: Zn; yükseltgen: Sn</w:t>
+        <w:t xml:space="preserve">(suda) + Sn(k)  c. İndirgen: Zn; yükseltgen: Sn</w:t>
       </w:r>
       <w:r>
         <w:rPr>
@@ -6843,7 +6843,7 @@
           <w:rFonts w:ascii="Times New Roman" w:hAnsi="Times New Roman" w:cs="Times New Roman"/>
           <w:lang w:val="tr-TR"/>
         </w:rPr>
-        <w:t xml:space="preserve">(suda) + Cu(k). 1 mol Zn çözünüp 1 mol Cu biriktiğinde kütle 65 − 64 = 1 g azalır. a) Kütle azalması 0,05 g olduğuna göre 0,050 mol Zn  b) 0,050 · 2 = 0,10 mol elektron  c) 0,050 mol · 64 g/mol = 3,2 g Cu</w:t>
+        <w:t xml:space="preserve">(suda) + Cu(k). 1 mol Zn çözünüp 1 mol Cu biriktiğinde kütle 65 − 64 = 1 g azalır. a) Kütle azalması 0,05 g olduğuna göre 0,050 mol Zn  b. 0,050 · 2 = 0,10 mol elektron  c. 0,050 mol · 64 g/mol = 3,2 g Cu</w:t>
       </w:r>
     </w:p>
     <w:p>
@@ -6883,7 +6883,7 @@
           <w:rFonts w:ascii="Times New Roman" w:hAnsi="Times New Roman" w:cs="Times New Roman"/>
           <w:lang w:val="tr-TR"/>
         </w:rPr>
-        <w:t xml:space="preserve">a) R &gt; T &gt; P &gt; H &gt; S. R üç metalin iyonunu, T iki metalin iyonunu, P bir metalin iyonunu indirgemiştir; S hiçbir iyonu indirgememiştir. P, R ve T asitten hidrojen açığa çıkarırken S çıkaramamıştır.  b) S metalinden yapılmış kapta hepsi saklanabilir; R metalinden yapılmış kapta hiçbiri saklanamaz.</w:t>
+        <w:t xml:space="preserve">a. R &gt; T &gt; P &gt; H &gt; S. R üç metalin iyonunu, T iki metalin iyonunu, P bir metalin iyonunu indirgemiştir; S hiçbir iyonu indirgememiştir. P, R ve T asitten hidrojen açığa çıkarırken S çıkaramamıştır.  b. S metalinden yapılmış kapta hepsi saklanabilir; R metalinden yapılmış kapta hiçbiri saklanamaz.</w:t>
       </w:r>
     </w:p>
     <w:p>
@@ -6968,7 +6968,7 @@
           <w:rFonts w:ascii="Times New Roman" w:hAnsi="Times New Roman" w:cs="Times New Roman"/>
           <w:lang w:val="tr-TR"/>
         </w:rPr>
-        <w:t xml:space="preserve">a) Zn &gt; Cr &gt; Fe &gt; H  b) 2Cr(k) + 3Fe</w:t>
+        <w:t xml:space="preserve">a. Zn &gt; Cr &gt; Fe &gt; H  b. 2Cr(k) + 3Fe</w:t>
       </w:r>
       <w:r>
         <w:rPr>
@@ -6998,7 +6998,7 @@
           <w:rFonts w:ascii="Times New Roman" w:hAnsi="Times New Roman" w:cs="Times New Roman"/>
           <w:lang w:val="tr-TR"/>
         </w:rPr>
-        <w:t xml:space="preserve">(suda) + 3Fe(k) (6 elektron aktarılır; iki tarafın toplam yükü +6)  c) Sonuç geçerli değildir. Kromun yüzeyi ince ve geçirimsiz bir oksit tabakasıyla kaplıdır; bu tabaka metali asitten yalıttığı için başlangıçta tepkime gözlenmez. Aktiflik değerlendirilirken metal yüzeyleri temizlenmeli, gözlemler dikkatle yorumlanmalı ve deney tekrarlanmalıdır.</w:t>
+        <w:t xml:space="preserve">(suda) + 3Fe(k) (6 elektron aktarılır; iki tarafın toplam yükü +6)  c. Sonuç geçerli değildir. Kromun yüzeyi ince ve geçirimsiz bir oksit tabakasıyla kaplıdır; bu tabaka metali asitten yalıttığı için başlangıçta tepkime gözlenmez. Aktiflik değerlendirilirken metal yüzeyleri temizlenmeli, gözlemler dikkatle yorumlanmalı ve deney tekrarlanmalıdır.</w:t>
       </w:r>
     </w:p>
     <w:p>
@@ -7143,7 +7143,7 @@
           <w:rFonts w:ascii="Times New Roman" w:hAnsi="Times New Roman" w:cs="Times New Roman"/>
           <w:lang w:val="tr-TR"/>
         </w:rPr>
-        <w:t xml:space="preserve">a) Zn(k) + Pb</w:t>
+        <w:t xml:space="preserve">a. Zn(k) + Pb</w:t>
       </w:r>
       <w:r>
         <w:rPr>
@@ -7173,7 +7173,7 @@
           <w:rFonts w:ascii="Times New Roman" w:hAnsi="Times New Roman" w:cs="Times New Roman"/>
           <w:lang w:val="tr-TR"/>
         </w:rPr>
-        <w:t xml:space="preserve">(suda) + Pb(k). Çözeltiye geçen her 65 g çinkoya karşılık çubukta 207 g kurşun birikir; bu nedenle kütle artar.  b) 1 mol Zn tepkimeye girdiğinde kütle 207 − 65 = 142 g artar; 14,2 / 142 = 0,10 mol Zn. Biriken kurşun: 0,10 · 207 = 20,7 g  c) Modelde çinko atomlarının ikişer elektron vererek Zn</w:t>
+        <w:t xml:space="preserve">(suda) + Pb(k). Çözeltiye geçen her 65 g çinkoya karşılık çubukta 207 g kurşun birikir; bu nedenle kütle artar.  b. 1 mol Zn tepkimeye girdiğinde kütle 207 − 65 = 142 g artar; 14,2 / 142 = 0,10 mol Zn. Biriken kurşun: 0,10 · 207 = 20,7 g  c. Modelde çinko atomlarının ikişer elektron vererek Zn</w:t>
       </w:r>
       <w:r>
         <w:rPr>
@@ -7361,7 +7361,7 @@
           <w:rFonts w:ascii="Times New Roman" w:hAnsi="Times New Roman" w:cs="Times New Roman"/>
           <w:lang w:val="tr-TR"/>
         </w:rPr>
-        <w:t xml:space="preserve">a) Mg(k) + Sn</w:t>
+        <w:t xml:space="preserve">a. Mg(k) + Sn</w:t>
       </w:r>
       <w:r>
         <w:rPr>
@@ -7406,7 +7406,7 @@
           <w:rFonts w:ascii="Times New Roman" w:hAnsi="Times New Roman" w:cs="Times New Roman"/>
           <w:lang w:val="tr-TR"/>
         </w:rPr>
-        <w:t xml:space="preserve"> = −0,14 − (−2,37) = 2,23 V  b) 0,48 / 24 = 0,020 mol Mg → 0,020 mol Sn; 0,020 · 119 = 2,38 g Sn</w:t>
+        <w:t xml:space="preserve"> = −0,14 − (−2,37) = 2,23 V  b. 0,48 / 24 = 0,020 mol Mg → 0,020 mol Sn; 0,020 · 119 = 2,38 g Sn</w:t>
       </w:r>
     </w:p>
     <w:p>
@@ -7681,7 +7681,7 @@
           <w:rFonts w:ascii="Times New Roman" w:hAnsi="Times New Roman" w:cs="Times New Roman"/>
           <w:lang w:val="tr-TR"/>
         </w:rPr>
-        <w:t xml:space="preserve"> derişimi azalır, ileri yöndeki eğilim azalır).  b) Azalır (ürün Zn</w:t>
+        <w:t xml:space="preserve"> derişimi azalır, ileri yöndeki eğilim azalır).  b. Azalır (ürün Zn</w:t>
       </w:r>
       <w:r>
         <w:rPr>
@@ -7696,7 +7696,7 @@
           <w:rFonts w:ascii="Times New Roman" w:hAnsi="Times New Roman" w:cs="Times New Roman"/>
           <w:lang w:val="tr-TR"/>
         </w:rPr>
-        <w:t xml:space="preserve"> derişimi artar).  c) Artar (ürün Zn</w:t>
+        <w:t xml:space="preserve"> derişimi artar).  c. Artar (ürün Zn</w:t>
       </w:r>
       <w:r>
         <w:rPr>
@@ -7711,7 +7711,7 @@
           <w:rFonts w:ascii="Times New Roman" w:hAnsi="Times New Roman" w:cs="Times New Roman"/>
           <w:lang w:val="tr-TR"/>
         </w:rPr>
-        <w:t xml:space="preserve"> derişimi azalır).  ç) Artar (tepken Ag</w:t>
+        <w:t xml:space="preserve"> derişimi azalır).  ç. Artar (tepken Ag</w:t>
       </w:r>
       <w:r>
         <w:rPr>
@@ -7726,7 +7726,7 @@
           <w:rFonts w:ascii="Times New Roman" w:hAnsi="Times New Roman" w:cs="Times New Roman"/>
           <w:lang w:val="tr-TR"/>
         </w:rPr>
-        <w:t xml:space="preserve"> derişimi artar).  d) Değişmez (elektrot yüzey alanı potansiyeli değil, çekilebilecek akımı etkiler).</w:t>
+        <w:t xml:space="preserve"> derişimi artar).  d. Değişmez (elektrot yüzey alanı potansiyeli değil, çekilebilecek akımı etkiler).</w:t>
       </w:r>
     </w:p>
     <w:p>
@@ -7766,7 +7766,7 @@
           <w:rFonts w:ascii="Times New Roman" w:hAnsi="Times New Roman" w:cs="Times New Roman"/>
           <w:lang w:val="tr-TR"/>
         </w:rPr>
-        <w:t xml:space="preserve">a) Katot: Ca</w:t>
+        <w:t xml:space="preserve">a. Katot: Ca</w:t>
       </w:r>
       <w:r>
         <w:rPr>
@@ -7871,7 +7871,7 @@
           <w:rFonts w:ascii="Times New Roman" w:hAnsi="Times New Roman" w:cs="Times New Roman"/>
           <w:lang w:val="tr-TR"/>
         </w:rPr>
-        <w:t xml:space="preserve">(g)  b) Anot (+) kutba bağlıdır. Ca</w:t>
+        <w:t xml:space="preserve">(g)  b. Anot (+) kutba bağlıdır. Ca</w:t>
       </w:r>
       <w:r>
         <w:rPr>
@@ -7901,7 +7901,7 @@
           <w:rFonts w:ascii="Times New Roman" w:hAnsi="Times New Roman" w:cs="Times New Roman"/>
           <w:lang w:val="tr-TR"/>
         </w:rPr>
-        <w:t xml:space="preserve"> iyonları anoda göç eder.  c) E°</w:t>
+        <w:t xml:space="preserve"> iyonları anoda göç eder.  c. E°</w:t>
       </w:r>
       <w:r>
         <w:rPr>
@@ -8310,7 +8310,7 @@
           <w:rFonts w:ascii="Times New Roman" w:hAnsi="Times New Roman" w:cs="Times New Roman"/>
           <w:lang w:val="tr-TR"/>
         </w:rPr>
-        <w:t xml:space="preserve">a) Çinko birikir. Katot: Zn</w:t>
+        <w:t xml:space="preserve">a. Çinko birikir. Katot: Zn</w:t>
       </w:r>
       <w:r>
         <w:rPr>
@@ -8370,7 +8370,7 @@
           <w:rFonts w:ascii="Times New Roman" w:hAnsi="Times New Roman" w:cs="Times New Roman"/>
           <w:lang w:val="tr-TR"/>
         </w:rPr>
-        <w:t xml:space="preserve">  b) Anot olarak bakır levha, elektrolit olarak bakır(II) sülfat çözeltisi kullanılmalı; anahtar yine (−) kutba bağlanmalıdır. Anot ve katotta aynı yarı tepkime zıt yönlerde gerçekleştiği için E°</w:t>
+        <w:t xml:space="preserve">  b. Anot olarak bakır levha, elektrolit olarak bakır(II) sülfat çözeltisi kullanılmalı; anahtar yine (−) kutba bağlanmalıdır. Anot ve katotta aynı yarı tepkime zıt yönlerde gerçekleştiği için E°</w:t>
       </w:r>
       <w:r>
         <w:rPr>
@@ -8385,7 +8385,7 @@
           <w:rFonts w:ascii="Times New Roman" w:hAnsi="Times New Roman" w:cs="Times New Roman"/>
           <w:lang w:val="tr-TR"/>
         </w:rPr>
-        <w:t xml:space="preserve"> = 0,34 − 0,34 = 0 V’tur; kuramsal olarak çok küçük bir gerilim yeterlidir.  c) Demirin çinkoyla kaplanmasına, yani galvanizlemeye benzer.</w:t>
+        <w:t xml:space="preserve"> = 0,34 − 0,34 = 0 V’tur; kuramsal olarak çok küçük bir gerilim yeterlidir.  c. Demirin çinkoyla kaplanmasına, yani galvanizlemeye benzer.</w:t>
       </w:r>
     </w:p>
     <w:p>
@@ -10064,7 +10064,7 @@
           <w:rFonts w:ascii="Times New Roman" w:hAnsi="Times New Roman" w:cs="Times New Roman"/>
           <w:lang w:val="tr-TR"/>
         </w:rPr>
-        <w:t xml:space="preserve">a) yükseltgen  b) negatif  c) pozitif  ç) elektrik yükü  d) galvanizleme</w:t>
+        <w:t xml:space="preserve">a. yükseltgen  b. negatif  c. pozitif  ç. elektrik yükü  d. galvanizleme</w:t>
       </w:r>
     </w:p>
     <w:p>
@@ -10144,7 +10144,7 @@
           <w:rFonts w:ascii="Times New Roman" w:hAnsi="Times New Roman" w:cs="Times New Roman"/>
           <w:lang w:val="tr-TR"/>
         </w:rPr>
-        <w:t xml:space="preserve">a) E°</w:t>
+        <w:t xml:space="preserve">a. E°</w:t>
       </w:r>
       <w:r>
         <w:rPr>
@@ -10159,7 +10159,7 @@
           <w:rFonts w:ascii="Times New Roman" w:hAnsi="Times New Roman" w:cs="Times New Roman"/>
           <w:lang w:val="tr-TR"/>
         </w:rPr>
-        <w:t xml:space="preserve"> = 0,80 − (−0,13) = 0,93 V  b) 4,32/108 = 0,040 mol Ag → 0,020 mol Pb; 0,020 · 207 = 4,14 g azalır.</w:t>
+        <w:t xml:space="preserve"> = 0,80 − (−0,13) = 0,93 V  b. 4,32/108 = 0,040 mol Ag → 0,020 mol Pb; 0,020 · 207 = 4,14 g azalır.</w:t>
       </w:r>
     </w:p>
     <w:p>
@@ -10239,7 +10239,7 @@
           <w:rFonts w:ascii="Times New Roman" w:hAnsi="Times New Roman" w:cs="Times New Roman"/>
           <w:lang w:val="tr-TR"/>
         </w:rPr>
-        <w:t xml:space="preserve">a) Hücre çalıştıkça tepken Cu</w:t>
+        <w:t xml:space="preserve">a. Hücre çalıştıkça tepken Cu</w:t>
       </w:r>
       <w:r>
         <w:rPr>
@@ -10269,7 +10269,7 @@
           <w:rFonts w:ascii="Times New Roman" w:hAnsi="Times New Roman" w:cs="Times New Roman"/>
           <w:lang w:val="tr-TR"/>
         </w:rPr>
-        <w:t xml:space="preserve"> iyonları birikir; ileri yöndeki eğilim azalır ve potansiyel düşer.  b) Örneğin bakır yarı hücresine CuSO</w:t>
+        <w:t xml:space="preserve"> iyonları birikir; ileri yöndeki eğilim azalır ve potansiyel düşer.  b. Örneğin bakır yarı hücresine CuSO</w:t>
       </w:r>
       <w:r>
         <w:rPr>
@@ -10284,7 +10284,7 @@
           <w:rFonts w:ascii="Times New Roman" w:hAnsi="Times New Roman" w:cs="Times New Roman"/>
           <w:lang w:val="tr-TR"/>
         </w:rPr>
-        <w:t xml:space="preserve"> katısı eklenip çözülmüş (tepken derişimi artırılmış) ya da çinko yarı hücresindeki çözeltinin bir kısmı saf suyla seyreltilmiş (ürün derişimi azaltılmış) olabilir; ileri yöndeki eğilim artar ve potansiyel yükselir.  c) Tepkime dengeye ulaşmıştır; ileri ve geri yöndeki eğilimler eşitlenmiş, dış devreden akım geçmez.</w:t>
+        <w:t xml:space="preserve"> katısı eklenip çözülmüş (tepken derişimi artırılmış) ya da çinko yarı hücresindeki çözeltinin bir kısmı saf suyla seyreltilmiş (ürün derişimi azaltılmış) olabilir; ileri yöndeki eğilim artar ve potansiyel yükselir.  c. Tepkime dengeye ulaşmıştır; ileri ve geri yöndeki eğilimler eşitlenmiş, dış devreden akım geçmez.</w:t>
       </w:r>
     </w:p>
     <w:p>

</xml_diff>